<commit_message>
docs: embed UAT screenshots in testing report Word document
Include Figure 1 (shift detail), Figure 2 (admin board), and Figure 3
(staff roster) inline with BUG-01 and BUG-02, plus an appendix catalogue.

Co-authored-by: promaxsolutions <promaxsolutions@users.noreply.github.com>
</commit_message>
<xml_diff>
--- a/docs/Promax_Care_Testing_Report.docx
+++ b/docs/Promax_Care_Testing_Report.docx
@@ -36,7 +36,7 @@
           <w:i/>
           <w:sz w:val="20"/>
         </w:rPr>
-        <w:t>Report Date: 03 October 2026  |  App Version: 1.1.0  |  Status: Open</w:t>
+        <w:t>Report Date: 03 October 2026  |  App Version: 1.1.0  |  Status: Open  |  Format: Microsoft Word (.docx)</w:t>
       </w:r>
     </w:p>
     <w:p>
@@ -52,7 +52,7 @@
     </w:p>
     <w:p>
       <w:r>
-        <w:t>This short testing report documents four defects observed during staff shift operations on the Promax Care mobile application. Issues were reproduced against a live shift for staff Serah Adeniyi and client Ajeh Wumi Tao (3 October 2026, 4:15 PM – 5:18 PM Australian time). Evidence includes staff dashboard, shift detail, and admin Schedule Board screenshots.</w:t>
+        <w:t>This short testing report documents four defects observed during staff shift operations on the Promax Care mobile application. Issues were reproduced against a live shift for staff Serah Adeniyi and client Ajeh Wumi Tao (3 October 2026, 4:15 PM – 5:18 PM Australian time). Evidence is attached as embedded screenshots (Figure 1–3) captured from the staff mobile app and the admin Schedule Board.</w:t>
       </w:r>
     </w:p>
     <w:tbl>
@@ -63,15 +63,16 @@
         <w:tblLook w:firstColumn="1" w:firstRow="1" w:lastColumn="0" w:lastRow="0" w:noHBand="0" w:noVBand="1" w:val="04A0"/>
       </w:tblPr>
       <w:tblGrid>
-        <w:gridCol w:w="2412"/>
-        <w:gridCol w:w="2412"/>
-        <w:gridCol w:w="2412"/>
-        <w:gridCol w:w="2412"/>
+        <w:gridCol w:w="1930"/>
+        <w:gridCol w:w="1930"/>
+        <w:gridCol w:w="1930"/>
+        <w:gridCol w:w="1930"/>
+        <w:gridCol w:w="1930"/>
       </w:tblGrid>
       <w:tr>
         <w:tc>
           <w:tcPr>
-            <w:tcW w:type="dxa" w:w="2412"/>
+            <w:tcW w:type="dxa" w:w="1930"/>
             <w:shd w:fill="030637" w:val="clear"/>
           </w:tcPr>
           <w:p>
@@ -87,7 +88,7 @@
         </w:tc>
         <w:tc>
           <w:tcPr>
-            <w:tcW w:type="dxa" w:w="2412"/>
+            <w:tcW w:type="dxa" w:w="1930"/>
             <w:shd w:fill="030637" w:val="clear"/>
           </w:tcPr>
           <w:p>
@@ -103,7 +104,7 @@
         </w:tc>
         <w:tc>
           <w:tcPr>
-            <w:tcW w:type="dxa" w:w="2412"/>
+            <w:tcW w:type="dxa" w:w="1930"/>
             <w:shd w:fill="030637" w:val="clear"/>
           </w:tcPr>
           <w:p>
@@ -119,7 +120,7 @@
         </w:tc>
         <w:tc>
           <w:tcPr>
-            <w:tcW w:type="dxa" w:w="2412"/>
+            <w:tcW w:type="dxa" w:w="1930"/>
             <w:shd w:fill="030637" w:val="clear"/>
           </w:tcPr>
           <w:p>
@@ -133,11 +134,27 @@
             </w:r>
           </w:p>
         </w:tc>
+        <w:tc>
+          <w:tcPr>
+            <w:tcW w:type="dxa" w:w="1930"/>
+            <w:shd w:fill="030637" w:val="clear"/>
+          </w:tcPr>
+          <w:p>
+            <w:r>
+              <w:rPr>
+                <w:b/>
+                <w:color w:val="FFFFFF"/>
+                <w:sz w:val="20"/>
+              </w:rPr>
+              <w:t>Screenshot refs</w:t>
+            </w:r>
+          </w:p>
+        </w:tc>
       </w:tr>
       <w:tr>
         <w:tc>
           <w:tcPr>
-            <w:tcW w:type="dxa" w:w="2412"/>
+            <w:tcW w:type="dxa" w:w="1930"/>
           </w:tcPr>
           <w:p>
             <w:r>
@@ -150,7 +167,7 @@
         </w:tc>
         <w:tc>
           <w:tcPr>
-            <w:tcW w:type="dxa" w:w="2412"/>
+            <w:tcW w:type="dxa" w:w="1930"/>
           </w:tcPr>
           <w:p>
             <w:r>
@@ -163,7 +180,7 @@
         </w:tc>
         <w:tc>
           <w:tcPr>
-            <w:tcW w:type="dxa" w:w="2412"/>
+            <w:tcW w:type="dxa" w:w="1930"/>
           </w:tcPr>
           <w:p>
             <w:r>
@@ -176,7 +193,7 @@
         </w:tc>
         <w:tc>
           <w:tcPr>
-            <w:tcW w:type="dxa" w:w="2412"/>
+            <w:tcW w:type="dxa" w:w="1930"/>
           </w:tcPr>
           <w:p>
             <w:r>
@@ -187,11 +204,24 @@
             </w:r>
           </w:p>
         </w:tc>
+        <w:tc>
+          <w:tcPr>
+            <w:tcW w:type="dxa" w:w="1930"/>
+          </w:tcPr>
+          <w:p>
+            <w:r>
+              <w:rPr>
+                <w:sz w:val="20"/>
+              </w:rPr>
+              <w:t>Figure 1</w:t>
+            </w:r>
+          </w:p>
+        </w:tc>
       </w:tr>
       <w:tr>
         <w:tc>
           <w:tcPr>
-            <w:tcW w:type="dxa" w:w="2412"/>
+            <w:tcW w:type="dxa" w:w="1930"/>
           </w:tcPr>
           <w:p>
             <w:r>
@@ -204,7 +234,7 @@
         </w:tc>
         <w:tc>
           <w:tcPr>
-            <w:tcW w:type="dxa" w:w="2412"/>
+            <w:tcW w:type="dxa" w:w="1930"/>
           </w:tcPr>
           <w:p>
             <w:r>
@@ -217,7 +247,7 @@
         </w:tc>
         <w:tc>
           <w:tcPr>
-            <w:tcW w:type="dxa" w:w="2412"/>
+            <w:tcW w:type="dxa" w:w="1930"/>
           </w:tcPr>
           <w:p>
             <w:r>
@@ -230,7 +260,7 @@
         </w:tc>
         <w:tc>
           <w:tcPr>
-            <w:tcW w:type="dxa" w:w="2412"/>
+            <w:tcW w:type="dxa" w:w="1930"/>
           </w:tcPr>
           <w:p>
             <w:r>
@@ -241,11 +271,24 @@
             </w:r>
           </w:p>
         </w:tc>
+        <w:tc>
+          <w:tcPr>
+            <w:tcW w:type="dxa" w:w="1930"/>
+          </w:tcPr>
+          <w:p>
+            <w:r>
+              <w:rPr>
+                <w:sz w:val="20"/>
+              </w:rPr>
+              <w:t>Figures 1, 2, 3</w:t>
+            </w:r>
+          </w:p>
+        </w:tc>
       </w:tr>
       <w:tr>
         <w:tc>
           <w:tcPr>
-            <w:tcW w:type="dxa" w:w="2412"/>
+            <w:tcW w:type="dxa" w:w="1930"/>
           </w:tcPr>
           <w:p>
             <w:r>
@@ -258,7 +301,7 @@
         </w:tc>
         <w:tc>
           <w:tcPr>
-            <w:tcW w:type="dxa" w:w="2412"/>
+            <w:tcW w:type="dxa" w:w="1930"/>
           </w:tcPr>
           <w:p>
             <w:r>
@@ -271,7 +314,7 @@
         </w:tc>
         <w:tc>
           <w:tcPr>
-            <w:tcW w:type="dxa" w:w="2412"/>
+            <w:tcW w:type="dxa" w:w="1930"/>
           </w:tcPr>
           <w:p>
             <w:r>
@@ -284,7 +327,7 @@
         </w:tc>
         <w:tc>
           <w:tcPr>
-            <w:tcW w:type="dxa" w:w="2412"/>
+            <w:tcW w:type="dxa" w:w="1930"/>
           </w:tcPr>
           <w:p>
             <w:r>
@@ -295,11 +338,24 @@
             </w:r>
           </w:p>
         </w:tc>
+        <w:tc>
+          <w:tcPr>
+            <w:tcW w:type="dxa" w:w="1930"/>
+          </w:tcPr>
+          <w:p>
+            <w:r>
+              <w:rPr>
+                <w:sz w:val="20"/>
+              </w:rPr>
+              <w:t>None provided</w:t>
+            </w:r>
+          </w:p>
+        </w:tc>
       </w:tr>
       <w:tr>
         <w:tc>
           <w:tcPr>
-            <w:tcW w:type="dxa" w:w="2412"/>
+            <w:tcW w:type="dxa" w:w="1930"/>
           </w:tcPr>
           <w:p>
             <w:r>
@@ -312,7 +368,7 @@
         </w:tc>
         <w:tc>
           <w:tcPr>
-            <w:tcW w:type="dxa" w:w="2412"/>
+            <w:tcW w:type="dxa" w:w="1930"/>
           </w:tcPr>
           <w:p>
             <w:r>
@@ -325,7 +381,7 @@
         </w:tc>
         <w:tc>
           <w:tcPr>
-            <w:tcW w:type="dxa" w:w="2412"/>
+            <w:tcW w:type="dxa" w:w="1930"/>
           </w:tcPr>
           <w:p>
             <w:r>
@@ -338,7 +394,7 @@
         </w:tc>
         <w:tc>
           <w:tcPr>
-            <w:tcW w:type="dxa" w:w="2412"/>
+            <w:tcW w:type="dxa" w:w="1930"/>
           </w:tcPr>
           <w:p>
             <w:r>
@@ -346,6 +402,19 @@
                 <w:sz w:val="20"/>
               </w:rPr>
               <w:t>Open</w:t>
+            </w:r>
+          </w:p>
+        </w:tc>
+        <w:tc>
+          <w:tcPr>
+            <w:tcW w:type="dxa" w:w="1930"/>
+          </w:tcPr>
+          <w:p>
+            <w:r>
+              <w:rPr>
+                <w:sz w:val="20"/>
+              </w:rPr>
+              <w:t>None provided</w:t>
             </w:r>
           </w:p>
         </w:tc>
@@ -627,7 +696,7 @@
               <w:rPr>
                 <w:sz w:val="20"/>
               </w:rPr>
-              <w:t>In Progress</w:t>
+              <w:t>In Progress — see Figure 2</w:t>
             </w:r>
           </w:p>
         </w:tc>
@@ -655,7 +724,7 @@
               <w:rPr>
                 <w:sz w:val="20"/>
               </w:rPr>
-              <w:t>Not Started</w:t>
+              <w:t>Not Started — see Figure 1</w:t>
             </w:r>
           </w:p>
         </w:tc>
@@ -683,13 +752,216 @@
               <w:rPr>
                 <w:sz w:val="20"/>
               </w:rPr>
-              <w:t>Sunday 4 Oct, 1:15 AM – 3:18 AM, ACTIVE</w:t>
+              <w:t>Sunday 4 Oct, 1:15 AM – 3:18 AM, ACTIVE — see Figure 3</w:t>
             </w:r>
           </w:p>
         </w:tc>
       </w:tr>
     </w:tbl>
     <w:p/>
+    <w:p>
+      <w:pPr>
+        <w:pStyle w:val="Heading2"/>
+      </w:pPr>
+      <w:r>
+        <w:rPr>
+          <w:color w:val="030637"/>
+        </w:rPr>
+        <w:t>2.1 Screenshot Catalogue</w:t>
+      </w:r>
+    </w:p>
+    <w:tbl>
+      <w:tblPr>
+        <w:tblStyle w:val="TableGrid"/>
+        <w:tblW w:type="auto" w:w="0"/>
+        <w:jc w:val="center"/>
+        <w:tblLook w:firstColumn="1" w:firstRow="1" w:lastColumn="0" w:lastRow="0" w:noHBand="0" w:noVBand="1" w:val="04A0"/>
+      </w:tblPr>
+      <w:tblGrid>
+        <w:gridCol w:w="3216"/>
+        <w:gridCol w:w="3216"/>
+        <w:gridCol w:w="3216"/>
+      </w:tblGrid>
+      <w:tr>
+        <w:tc>
+          <w:tcPr>
+            <w:tcW w:type="dxa" w:w="3216"/>
+            <w:shd w:fill="030637" w:val="clear"/>
+          </w:tcPr>
+          <w:p>
+            <w:r>
+              <w:rPr>
+                <w:b/>
+                <w:color w:val="FFFFFF"/>
+                <w:sz w:val="20"/>
+              </w:rPr>
+              <w:t>Ref</w:t>
+            </w:r>
+          </w:p>
+        </w:tc>
+        <w:tc>
+          <w:tcPr>
+            <w:tcW w:type="dxa" w:w="3216"/>
+            <w:shd w:fill="030637" w:val="clear"/>
+          </w:tcPr>
+          <w:p>
+            <w:r>
+              <w:rPr>
+                <w:b/>
+                <w:color w:val="FFFFFF"/>
+                <w:sz w:val="20"/>
+              </w:rPr>
+              <w:t>Source</w:t>
+            </w:r>
+          </w:p>
+        </w:tc>
+        <w:tc>
+          <w:tcPr>
+            <w:tcW w:type="dxa" w:w="3216"/>
+            <w:shd w:fill="030637" w:val="clear"/>
+          </w:tcPr>
+          <w:p>
+            <w:r>
+              <w:rPr>
+                <w:b/>
+                <w:color w:val="FFFFFF"/>
+                <w:sz w:val="20"/>
+              </w:rPr>
+              <w:t>What it shows</w:t>
+            </w:r>
+          </w:p>
+        </w:tc>
+      </w:tr>
+      <w:tr>
+        <w:tc>
+          <w:tcPr>
+            <w:tcW w:type="dxa" w:w="3216"/>
+          </w:tcPr>
+          <w:p>
+            <w:r>
+              <w:rPr>
+                <w:sz w:val="20"/>
+              </w:rPr>
+              <w:t>Figure 1</w:t>
+            </w:r>
+          </w:p>
+        </w:tc>
+        <w:tc>
+          <w:tcPr>
+            <w:tcW w:type="dxa" w:w="3216"/>
+          </w:tcPr>
+          <w:p>
+            <w:r>
+              <w:rPr>
+                <w:sz w:val="20"/>
+              </w:rPr>
+              <w:t>Staff mobile — shift detail</w:t>
+            </w:r>
+          </w:p>
+        </w:tc>
+        <w:tc>
+          <w:tcPr>
+            <w:tcW w:type="dxa" w:w="3216"/>
+          </w:tcPr>
+          <w:p>
+            <w:r>
+              <w:rPr>
+                <w:sz w:val="20"/>
+              </w:rPr>
+              <w:t>Date 3 Oct; times 4:15–5:18 PM; Not Started; transport button visible; no clock-in</w:t>
+            </w:r>
+          </w:p>
+        </w:tc>
+      </w:tr>
+      <w:tr>
+        <w:tc>
+          <w:tcPr>
+            <w:tcW w:type="dxa" w:w="3216"/>
+          </w:tcPr>
+          <w:p>
+            <w:r>
+              <w:rPr>
+                <w:sz w:val="20"/>
+              </w:rPr>
+              <w:t>Figure 2</w:t>
+            </w:r>
+          </w:p>
+        </w:tc>
+        <w:tc>
+          <w:tcPr>
+            <w:tcW w:type="dxa" w:w="3216"/>
+          </w:tcPr>
+          <w:p>
+            <w:r>
+              <w:rPr>
+                <w:sz w:val="20"/>
+              </w:rPr>
+              <w:t>Admin web — Schedule Board</w:t>
+            </w:r>
+          </w:p>
+        </w:tc>
+        <w:tc>
+          <w:tcPr>
+            <w:tcW w:type="dxa" w:w="3216"/>
+          </w:tcPr>
+          <w:p>
+            <w:r>
+              <w:rPr>
+                <w:sz w:val="20"/>
+              </w:rPr>
+              <w:t>Same shift Sat 3 Oct 4:15–5:18 PM Sydney shown In Progress</w:t>
+            </w:r>
+          </w:p>
+        </w:tc>
+      </w:tr>
+      <w:tr>
+        <w:tc>
+          <w:tcPr>
+            <w:tcW w:type="dxa" w:w="3216"/>
+          </w:tcPr>
+          <w:p>
+            <w:r>
+              <w:rPr>
+                <w:sz w:val="20"/>
+              </w:rPr>
+              <w:t>Figure 3</w:t>
+            </w:r>
+          </w:p>
+        </w:tc>
+        <w:tc>
+          <w:tcPr>
+            <w:tcW w:type="dxa" w:w="3216"/>
+          </w:tcPr>
+          <w:p>
+            <w:r>
+              <w:rPr>
+                <w:sz w:val="20"/>
+              </w:rPr>
+              <w:t>Staff mobile — Shift Roster</w:t>
+            </w:r>
+          </w:p>
+        </w:tc>
+        <w:tc>
+          <w:tcPr>
+            <w:tcW w:type="dxa" w:w="3216"/>
+          </w:tcPr>
+          <w:p>
+            <w:r>
+              <w:rPr>
+                <w:sz w:val="20"/>
+              </w:rPr>
+              <w:t>Same shift listed on Sunday 4 Oct at 1:15–3:18 AM, ACTIVE</w:t>
+            </w:r>
+          </w:p>
+        </w:tc>
+      </w:tr>
+    </w:tbl>
+    <w:p/>
+    <w:p>
+      <w:r>
+        <w:t>Screenshots are embedded in the relevant defect sections below and repeated in Appendix A.</w:t>
+      </w:r>
+    </w:p>
     <w:p>
       <w:pPr>
         <w:pStyle w:val="Heading1"/>
@@ -708,6 +980,17 @@
           <w:color w:val="C0392B"/>
         </w:rPr>
         <w:t>Severity: High</w:t>
+      </w:r>
+    </w:p>
+    <w:p>
+      <w:r>
+        <w:rPr>
+          <w:b/>
+        </w:rPr>
+        <w:t xml:space="preserve">Screenshot reference: </w:t>
+      </w:r>
+      <w:r>
+        <w:t>Figure 1</w:t>
       </w:r>
     </w:p>
     <w:p>
@@ -745,10 +1028,10 @@
         <w:rPr>
           <w:b/>
         </w:rPr>
-        <w:t>Screenshot:</w:t>
+        <w:t xml:space="preserve">Observed: </w:t>
       </w:r>
       <w:r>
-        <w:t xml:space="preserve"> On shift detail while status shows “Not Started” and message reads “Your shift hasn't started yet…”, the transport (steering wheel) control remains visible and usable.</w:t>
+        <w:t xml:space="preserve"> Shift detail shows status “Not Started” and “Your shift hasn't started yet. You can request to cancel if needed.” The transport (steering wheel) control remains visible and usable (Figure 1).</w:t>
       </w:r>
     </w:p>
     <w:p>
@@ -759,10 +1042,76 @@
         <w:rPr>
           <w:b/>
         </w:rPr>
-        <w:t>Code note:</w:t>
+        <w:t xml:space="preserve">Code note: </w:t>
       </w:r>
       <w:r>
         <w:t xml:space="preserve"> Transport button is shown whenever the shift activities include “Transport”, with no check that the shift is in progress. Status-based guards are commented out in code (shift detail screen).</w:t>
+      </w:r>
+    </w:p>
+    <w:p>
+      <w:pPr>
+        <w:jc w:val="left"/>
+      </w:pPr>
+      <w:r>
+        <w:rPr>
+          <w:b/>
+          <w:color w:val="030637"/>
+          <w:sz w:val="22"/>
+        </w:rPr>
+        <w:t>Figure 1 — Staff shift detail — Not Started, transport control visible</w:t>
+      </w:r>
+    </w:p>
+    <w:p>
+      <w:pPr>
+        <w:jc w:val="center"/>
+      </w:pPr>
+      <w:r>
+        <w:drawing>
+          <wp:inline xmlns:a="http://schemas.openxmlformats.org/drawingml/2006/main" xmlns:pic="http://schemas.openxmlformats.org/drawingml/2006/picture">
+            <wp:extent cx="2148840" cy="4654002"/>
+            <wp:docPr id="1" name="Picture 1"/>
+            <wp:cNvGraphicFramePr>
+              <a:graphicFrameLocks noChangeAspect="1"/>
+            </wp:cNvGraphicFramePr>
+            <a:graphic>
+              <a:graphicData uri="http://schemas.openxmlformats.org/drawingml/2006/picture">
+                <pic:pic>
+                  <pic:nvPicPr>
+                    <pic:cNvPr id="0" name="fig-01-shift-detail-not-started.jpg"/>
+                    <pic:cNvPicPr/>
+                  </pic:nvPicPr>
+                  <pic:blipFill>
+                    <a:blip r:embed="rId9"/>
+                    <a:stretch>
+                      <a:fillRect/>
+                    </a:stretch>
+                  </pic:blipFill>
+                  <pic:spPr>
+                    <a:xfrm>
+                      <a:off x="0" y="0"/>
+                      <a:ext cx="2148840" cy="4654002"/>
+                    </a:xfrm>
+                    <a:prstGeom prst="rect"/>
+                  </pic:spPr>
+                </pic:pic>
+              </a:graphicData>
+            </a:graphic>
+          </wp:inline>
+        </w:drawing>
+      </w:r>
+    </w:p>
+    <w:p>
+      <w:pPr>
+        <w:spacing w:after="240"/>
+        <w:jc w:val="left"/>
+      </w:pPr>
+      <w:r>
+        <w:rPr>
+          <w:i/>
+          <w:color w:val="444444"/>
+          <w:sz w:val="18"/>
+        </w:rPr>
+        <w:t>Staff mobile shift detail for client Ajeh Wumi Tao (staff Serah Adeniyi). Date shows 3 October 2026, start 4:15 PM / end 5:18 PM. Status is “Not Started” with message “Your shift hasn't started yet.” Transport (steering wheel) button is still visible. CTA is “Request to Cancel Shift”; clock-in is not offered.</w:t>
       </w:r>
     </w:p>
     <w:p>
@@ -781,7 +1130,7 @@
         <w:pStyle w:val="ListNumber"/>
       </w:pPr>
       <w:r>
-        <w:t>Open a shift that includes the Transport activity.</w:t>
+        <w:t>Open a shift that includes the Transport activity (see Figure 1).</w:t>
       </w:r>
     </w:p>
     <w:p>
@@ -797,7 +1146,7 @@
         <w:pStyle w:val="ListNumber"/>
       </w:pPr>
       <w:r>
-        <w:t>Tap the transport / trip control on the shift detail screen.</w:t>
+        <w:t>Tap the transport / trip control on the shift detail screen (steering-wheel button in Figure 1).</w:t>
       </w:r>
     </w:p>
     <w:p>
@@ -887,7 +1236,7 @@
               <w:rPr>
                 <w:sz w:val="20"/>
               </w:rPr>
-              <w:t>Trip control available before start and after shift has passed.</w:t>
+              <w:t>Trip control available before start (Figure 1) and after shift has passed.</w:t>
             </w:r>
           </w:p>
         </w:tc>
@@ -912,6 +1261,17 @@
           <w:color w:val="8B0000"/>
         </w:rPr>
         <w:t>Severity: Critical</w:t>
+      </w:r>
+    </w:p>
+    <w:p>
+      <w:r>
+        <w:rPr>
+          <w:b/>
+        </w:rPr>
+        <w:t xml:space="preserve">Screenshot references: </w:t>
+      </w:r>
+      <w:r>
+        <w:t>Figure 2 (admin), Figure 3 (staff roster), Figure 1 (staff detail)</w:t>
       </w:r>
     </w:p>
     <w:p>
@@ -954,10 +1314,10 @@
         <w:rPr>
           <w:b/>
         </w:rPr>
-        <w:t>Admin:</w:t>
+        <w:t xml:space="preserve">Admin: </w:t>
       </w:r>
       <w:r>
-        <w:t xml:space="preserve"> Admin Schedule Board at 4:17:31 pm – Sydney, AU shows shift Sat Oct 3, 4:15 PM – 5:18 PM as “In Progress”.</w:t>
+        <w:t xml:space="preserve"> Admin Schedule Board at 4:17:31 pm – Sydney, AU shows shift Sat Oct 3, 4:15 PM – 5:18 PM as “In Progress” (Figure 2).</w:t>
       </w:r>
     </w:p>
     <w:p>
@@ -968,10 +1328,10 @@
         <w:rPr>
           <w:b/>
         </w:rPr>
-        <w:t>Staff roster:</w:t>
+        <w:t xml:space="preserve">Staff roster: </w:t>
       </w:r>
       <w:r>
-        <w:t xml:space="preserve"> Staff Shift Roster selects Sunday Oct 4 and shows the same client/activities at 1:15 AM – 3:18 AM with status ACTIVE.</w:t>
+        <w:t xml:space="preserve"> Staff Shift Roster selects Sunday Oct 4 and shows the same client/activities at 1:15 AM – 3:18 AM with status ACTIVE (Figure 3).</w:t>
       </w:r>
     </w:p>
     <w:p>
@@ -982,10 +1342,10 @@
         <w:rPr>
           <w:b/>
         </w:rPr>
-        <w:t>Staff detail:</w:t>
+        <w:t xml:space="preserve">Staff detail: </w:t>
       </w:r>
       <w:r>
-        <w:t xml:space="preserve"> Shift detail title/client Ajeh Wumi Tao; Date field “3 October, 2026”; status “Not Started”; CTA “Request to Cancel Shift” (no clock-in).</w:t>
+        <w:t xml:space="preserve"> Shift detail Date field is “3 October, 2026”; start/end 4:15 PM / 5:18 PM; status “Not Started”; CTA “Request to Cancel Shift” with no clock-in (Figure 1).</w:t>
       </w:r>
     </w:p>
     <w:p>
@@ -996,10 +1356,241 @@
         <w:rPr>
           <w:b/>
         </w:rPr>
-        <w:t>Code note:</w:t>
+        <w:t xml:space="preserve">Code note: </w:t>
       </w:r>
       <w:r>
         <w:t xml:space="preserve"> Detail “Date” uses dateCreated (not dateFrom). Roster calendar day chips use device-local dates while shift grouping/times use Australia/Sydney helpers — mixed sources can place a shift on the wrong day and block clock-in.</w:t>
+      </w:r>
+    </w:p>
+    <w:p>
+      <w:pPr>
+        <w:pStyle w:val="Heading3"/>
+      </w:pPr>
+      <w:r>
+        <w:rPr>
+          <w:color w:val="030637"/>
+        </w:rPr>
+        <w:t>4.2.1 Admin (expected source of truth)</w:t>
+      </w:r>
+    </w:p>
+    <w:p>
+      <w:pPr>
+        <w:jc w:val="left"/>
+      </w:pPr>
+      <w:r>
+        <w:rPr>
+          <w:b/>
+          <w:color w:val="030637"/>
+          <w:sz w:val="22"/>
+        </w:rPr>
+        <w:t>Figure 2 — Admin Schedule Board — same shift In Progress (Sydney)</w:t>
+      </w:r>
+    </w:p>
+    <w:p>
+      <w:pPr>
+        <w:jc w:val="center"/>
+      </w:pPr>
+      <w:r>
+        <w:drawing>
+          <wp:inline xmlns:a="http://schemas.openxmlformats.org/drawingml/2006/main" xmlns:pic="http://schemas.openxmlformats.org/drawingml/2006/picture">
+            <wp:extent cx="3291840" cy="5078839"/>
+            <wp:docPr id="2" name="Picture 2"/>
+            <wp:cNvGraphicFramePr>
+              <a:graphicFrameLocks noChangeAspect="1"/>
+            </wp:cNvGraphicFramePr>
+            <a:graphic>
+              <a:graphicData uri="http://schemas.openxmlformats.org/drawingml/2006/picture">
+                <pic:pic>
+                  <pic:nvPicPr>
+                    <pic:cNvPr id="0" name="fig-02-admin-schedule-board.jpg"/>
+                    <pic:cNvPicPr/>
+                  </pic:nvPicPr>
+                  <pic:blipFill>
+                    <a:blip r:embed="rId10"/>
+                    <a:stretch>
+                      <a:fillRect/>
+                    </a:stretch>
+                  </pic:blipFill>
+                  <pic:spPr>
+                    <a:xfrm>
+                      <a:off x="0" y="0"/>
+                      <a:ext cx="3291840" cy="5078839"/>
+                    </a:xfrm>
+                    <a:prstGeom prst="rect"/>
+                  </pic:spPr>
+                </pic:pic>
+              </a:graphicData>
+            </a:graphic>
+          </wp:inline>
+        </w:drawing>
+      </w:r>
+    </w:p>
+    <w:p>
+      <w:pPr>
+        <w:spacing w:after="240"/>
+        <w:jc w:val="left"/>
+      </w:pPr>
+      <w:r>
+        <w:rPr>
+          <w:i/>
+          <w:color w:val="444444"/>
+          <w:sz w:val="18"/>
+        </w:rPr>
+        <w:t>ProMax Care web Schedule Board at app.promaxcare.com.au (header 4:17:31 pm – Sydney, AU). Saturday 3 October 2026, 4:15 PM – 5:18 PM for staff Serah Adeniyi / client Ajeh Wumi Tao is shown as “In Progress” with activities Transport, Install phone, Personal Support.</w:t>
+      </w:r>
+    </w:p>
+    <w:p>
+      <w:pPr>
+        <w:pStyle w:val="Heading3"/>
+      </w:pPr>
+      <w:r>
+        <w:rPr>
+          <w:color w:val="030637"/>
+        </w:rPr>
+        <w:t>4.2.2 Staff roster (wrong calendar day / converted times)</w:t>
+      </w:r>
+    </w:p>
+    <w:p>
+      <w:pPr>
+        <w:jc w:val="left"/>
+      </w:pPr>
+      <w:r>
+        <w:rPr>
+          <w:b/>
+          <w:color w:val="030637"/>
+          <w:sz w:val="22"/>
+        </w:rPr>
+        <w:t>Figure 3 — Staff roster dashboard — shift listed on 4 October</w:t>
+      </w:r>
+    </w:p>
+    <w:p>
+      <w:pPr>
+        <w:jc w:val="center"/>
+      </w:pPr>
+      <w:r>
+        <w:drawing>
+          <wp:inline xmlns:a="http://schemas.openxmlformats.org/drawingml/2006/main" xmlns:pic="http://schemas.openxmlformats.org/drawingml/2006/picture">
+            <wp:extent cx="2148840" cy="4654002"/>
+            <wp:docPr id="3" name="Picture 3"/>
+            <wp:cNvGraphicFramePr>
+              <a:graphicFrameLocks noChangeAspect="1"/>
+            </wp:cNvGraphicFramePr>
+            <a:graphic>
+              <a:graphicData uri="http://schemas.openxmlformats.org/drawingml/2006/picture">
+                <pic:pic>
+                  <pic:nvPicPr>
+                    <pic:cNvPr id="0" name="fig-03-staff-roster-4-oct.jpg"/>
+                    <pic:cNvPicPr/>
+                  </pic:nvPicPr>
+                  <pic:blipFill>
+                    <a:blip r:embed="rId11"/>
+                    <a:stretch>
+                      <a:fillRect/>
+                    </a:stretch>
+                  </pic:blipFill>
+                  <pic:spPr>
+                    <a:xfrm>
+                      <a:off x="0" y="0"/>
+                      <a:ext cx="2148840" cy="4654002"/>
+                    </a:xfrm>
+                    <a:prstGeom prst="rect"/>
+                  </pic:spPr>
+                </pic:pic>
+              </a:graphicData>
+            </a:graphic>
+          </wp:inline>
+        </w:drawing>
+      </w:r>
+    </w:p>
+    <w:p>
+      <w:pPr>
+        <w:spacing w:after="240"/>
+        <w:jc w:val="left"/>
+      </w:pPr>
+      <w:r>
+        <w:rPr>
+          <w:i/>
+          <w:color w:val="444444"/>
+          <w:sz w:val="18"/>
+        </w:rPr>
+        <w:t>Staff mobile Shift Roster for Serah. Calendar selects Sunday 4 October 2026. The same client/activities card shows 1:15 AM – 3:18 AM with status ACTIVE, instead of Saturday 3 October 4:15 PM – 5:18 PM Australian time.</w:t>
+      </w:r>
+    </w:p>
+    <w:p>
+      <w:pPr>
+        <w:pStyle w:val="Heading3"/>
+      </w:pPr>
+      <w:r>
+        <w:rPr>
+          <w:color w:val="030637"/>
+        </w:rPr>
+        <w:t>4.2.3 Staff detail (date 3 Oct, clock-in blocked)</w:t>
+      </w:r>
+    </w:p>
+    <w:p>
+      <w:pPr>
+        <w:jc w:val="left"/>
+      </w:pPr>
+      <w:r>
+        <w:rPr>
+          <w:b/>
+          <w:color w:val="030637"/>
+          <w:sz w:val="22"/>
+        </w:rPr>
+        <w:t>Figure 1 — Staff shift detail — Not Started, transport control visible</w:t>
+      </w:r>
+    </w:p>
+    <w:p>
+      <w:pPr>
+        <w:jc w:val="center"/>
+      </w:pPr>
+      <w:r>
+        <w:drawing>
+          <wp:inline xmlns:a="http://schemas.openxmlformats.org/drawingml/2006/main" xmlns:pic="http://schemas.openxmlformats.org/drawingml/2006/picture">
+            <wp:extent cx="2148840" cy="4654002"/>
+            <wp:docPr id="4" name="Picture 4"/>
+            <wp:cNvGraphicFramePr>
+              <a:graphicFrameLocks noChangeAspect="1"/>
+            </wp:cNvGraphicFramePr>
+            <a:graphic>
+              <a:graphicData uri="http://schemas.openxmlformats.org/drawingml/2006/picture">
+                <pic:pic>
+                  <pic:nvPicPr>
+                    <pic:cNvPr id="0" name="fig-01-shift-detail-not-started.jpg"/>
+                    <pic:cNvPicPr/>
+                  </pic:nvPicPr>
+                  <pic:blipFill>
+                    <a:blip r:embed="rId9"/>
+                    <a:stretch>
+                      <a:fillRect/>
+                    </a:stretch>
+                  </pic:blipFill>
+                  <pic:spPr>
+                    <a:xfrm>
+                      <a:off x="0" y="0"/>
+                      <a:ext cx="2148840" cy="4654002"/>
+                    </a:xfrm>
+                    <a:prstGeom prst="rect"/>
+                  </pic:spPr>
+                </pic:pic>
+              </a:graphicData>
+            </a:graphic>
+          </wp:inline>
+        </w:drawing>
+      </w:r>
+    </w:p>
+    <w:p>
+      <w:pPr>
+        <w:spacing w:after="240"/>
+        <w:jc w:val="left"/>
+      </w:pPr>
+      <w:r>
+        <w:rPr>
+          <w:i/>
+          <w:color w:val="444444"/>
+          <w:sz w:val="18"/>
+        </w:rPr>
+        <w:t>Staff mobile shift detail for client Ajeh Wumi Tao (staff Serah Adeniyi). Date shows 3 October 2026, start 4:15 PM / end 5:18 PM. Status is “Not Started” with message “Your shift hasn't started yet.” Transport (steering wheel) button is still visible. CTA is “Request to Cancel Shift”; clock-in is not offered.</w:t>
       </w:r>
     </w:p>
     <w:p>
@@ -1018,7 +1609,7 @@
         <w:pStyle w:val="ListNumber"/>
       </w:pPr>
       <w:r>
-        <w:t>In admin, create/confirm a shift for 3 Oct 2026, 4:15 PM – 5:18 PM Australian time.</w:t>
+        <w:t>In admin, create/confirm a shift for 3 Oct 2026, 4:15 PM – 5:18 PM Australian time (Figure 2).</w:t>
       </w:r>
     </w:p>
     <w:p>
@@ -1026,7 +1617,7 @@
         <w:pStyle w:val="ListNumber"/>
       </w:pPr>
       <w:r>
-        <w:t>On staff mobile, open Shift Roster and locate the shift.</w:t>
+        <w:t>On staff mobile, open Shift Roster and locate the shift (Figure 3).</w:t>
       </w:r>
     </w:p>
     <w:p>
@@ -1042,7 +1633,7 @@
         <w:pStyle w:val="ListNumber"/>
       </w:pPr>
       <w:r>
-        <w:t>Open shift detail and compare Date, Start Time, End Time, and status.</w:t>
+        <w:t>Open shift detail and compare Date, Start Time, End Time, and status (Figure 1).</w:t>
       </w:r>
     </w:p>
     <w:p>
@@ -1072,13 +1663,14 @@
         <w:tblLook w:firstColumn="1" w:firstRow="1" w:lastColumn="0" w:lastRow="0" w:noHBand="0" w:noVBand="1" w:val="04A0"/>
       </w:tblPr>
       <w:tblGrid>
-        <w:gridCol w:w="4824"/>
-        <w:gridCol w:w="4824"/>
+        <w:gridCol w:w="3216"/>
+        <w:gridCol w:w="3216"/>
+        <w:gridCol w:w="3216"/>
       </w:tblGrid>
       <w:tr>
         <w:tc>
           <w:tcPr>
-            <w:tcW w:type="dxa" w:w="4824"/>
+            <w:tcW w:type="dxa" w:w="3216"/>
             <w:shd w:fill="030637" w:val="clear"/>
           </w:tcPr>
           <w:p>
@@ -1094,7 +1686,7 @@
         </w:tc>
         <w:tc>
           <w:tcPr>
-            <w:tcW w:type="dxa" w:w="4824"/>
+            <w:tcW w:type="dxa" w:w="3216"/>
             <w:shd w:fill="030637" w:val="clear"/>
           </w:tcPr>
           <w:p>
@@ -1108,11 +1700,27 @@
             </w:r>
           </w:p>
         </w:tc>
+        <w:tc>
+          <w:tcPr>
+            <w:tcW w:type="dxa" w:w="3216"/>
+            <w:shd w:fill="030637" w:val="clear"/>
+          </w:tcPr>
+          <w:p>
+            <w:r>
+              <w:rPr>
+                <w:b/>
+                <w:color w:val="FFFFFF"/>
+                <w:sz w:val="20"/>
+              </w:rPr>
+              <w:t>Evidence</w:t>
+            </w:r>
+          </w:p>
+        </w:tc>
       </w:tr>
       <w:tr>
         <w:tc>
           <w:tcPr>
-            <w:tcW w:type="dxa" w:w="4824"/>
+            <w:tcW w:type="dxa" w:w="3216"/>
           </w:tcPr>
           <w:p>
             <w:r>
@@ -1125,7 +1733,7 @@
         </w:tc>
         <w:tc>
           <w:tcPr>
-            <w:tcW w:type="dxa" w:w="4824"/>
+            <w:tcW w:type="dxa" w:w="3216"/>
           </w:tcPr>
           <w:p>
             <w:r>
@@ -1136,11 +1744,24 @@
             </w:r>
           </w:p>
         </w:tc>
+        <w:tc>
+          <w:tcPr>
+            <w:tcW w:type="dxa" w:w="3216"/>
+          </w:tcPr>
+          <w:p>
+            <w:r>
+              <w:rPr>
+                <w:sz w:val="20"/>
+              </w:rPr>
+              <w:t>Figures 3 and 1 vs Figure 2</w:t>
+            </w:r>
+          </w:p>
+        </w:tc>
       </w:tr>
       <w:tr>
         <w:tc>
           <w:tcPr>
-            <w:tcW w:type="dxa" w:w="4824"/>
+            <w:tcW w:type="dxa" w:w="3216"/>
           </w:tcPr>
           <w:p>
             <w:r>
@@ -1153,7 +1774,7 @@
         </w:tc>
         <w:tc>
           <w:tcPr>
-            <w:tcW w:type="dxa" w:w="4824"/>
+            <w:tcW w:type="dxa" w:w="3216"/>
           </w:tcPr>
           <w:p>
             <w:r>
@@ -1164,11 +1785,24 @@
             </w:r>
           </w:p>
         </w:tc>
+        <w:tc>
+          <w:tcPr>
+            <w:tcW w:type="dxa" w:w="3216"/>
+          </w:tcPr>
+          <w:p>
+            <w:r>
+              <w:rPr>
+                <w:sz w:val="20"/>
+              </w:rPr>
+              <w:t>Figure 1</w:t>
+            </w:r>
+          </w:p>
+        </w:tc>
       </w:tr>
       <w:tr>
         <w:tc>
           <w:tcPr>
-            <w:tcW w:type="dxa" w:w="4824"/>
+            <w:tcW w:type="dxa" w:w="3216"/>
           </w:tcPr>
           <w:p>
             <w:r>
@@ -1181,7 +1815,7 @@
         </w:tc>
         <w:tc>
           <w:tcPr>
-            <w:tcW w:type="dxa" w:w="4824"/>
+            <w:tcW w:type="dxa" w:w="3216"/>
           </w:tcPr>
           <w:p>
             <w:r>
@@ -1189,6 +1823,19 @@
                 <w:sz w:val="20"/>
               </w:rPr>
               <w:t>Admin: In Progress; Staff detail: Not Started.</w:t>
+            </w:r>
+          </w:p>
+        </w:tc>
+        <w:tc>
+          <w:tcPr>
+            <w:tcW w:type="dxa" w:w="3216"/>
+          </w:tcPr>
+          <w:p>
+            <w:r>
+              <w:rPr>
+                <w:sz w:val="20"/>
+              </w:rPr>
+              <w:t>Figures 2 and 1</w:t>
             </w:r>
           </w:p>
         </w:tc>
@@ -1213,6 +1860,17 @@
           <w:color w:val="C0392B"/>
         </w:rPr>
         <w:t>Severity: High</w:t>
+      </w:r>
+    </w:p>
+    <w:p>
+      <w:r>
+        <w:rPr>
+          <w:b/>
+        </w:rPr>
+        <w:t xml:space="preserve">Screenshot reference: </w:t>
+      </w:r>
+      <w:r>
+        <w:t>None provided for this defect. Reproduce and attach picker/error screen on retest.</w:t>
       </w:r>
     </w:p>
     <w:p>
@@ -1250,7 +1908,7 @@
         <w:rPr>
           <w:b/>
         </w:rPr>
-        <w:t>Picker types:</w:t>
+        <w:t xml:space="preserve">Picker types: </w:t>
       </w:r>
       <w:r>
         <w:t xml:space="preserve"> Upload uses DocumentPicker with a limited MIME list: image/jpeg, application/pdf, and Word types only. image/png (and broader image/*) are not included.</w:t>
@@ -1264,7 +1922,7 @@
         <w:rPr>
           <w:b/>
         </w:rPr>
-        <w:t>UX gap:</w:t>
+        <w:t xml:space="preserve">UX gap: </w:t>
       </w:r>
       <w:r>
         <w:t xml:space="preserve"> There is no ImagePicker / camera path on the document forms (unlike profile photo), so many phone photos (often PNG/HEIC) cannot be selected reliably.</w:t>
@@ -1303,6 +1961,14 @@
       </w:pPr>
       <w:r>
         <w:t>Observe that the image is rejected, unavailable in the picker, or fails upload.</w:t>
+      </w:r>
+    </w:p>
+    <w:p>
+      <w:pPr>
+        <w:pStyle w:val="ListNumber"/>
+      </w:pPr>
+      <w:r>
+        <w:t>Capture the picker/error screen and attach as Figure 4 on retest.</w:t>
       </w:r>
     </w:p>
     <w:p>
@@ -1420,6 +2086,17 @@
       </w:r>
     </w:p>
     <w:p>
+      <w:r>
+        <w:rPr>
+          <w:b/>
+        </w:rPr>
+        <w:t xml:space="preserve">Screenshot reference: </w:t>
+      </w:r>
+      <w:r>
+        <w:t>None provided for this defect. Figure 1 shows a single-client header (Ajeh Wumi Tao). Reproduce with two+ clients and attach report/trip screens on retest.</w:t>
+      </w:r>
+    </w:p>
+    <w:p>
       <w:pPr>
         <w:pStyle w:val="Heading2"/>
       </w:pPr>
@@ -1454,7 +2131,7 @@
         <w:rPr>
           <w:b/>
         </w:rPr>
-        <w:t>Data model:</w:t>
+        <w:t xml:space="preserve">Data model: </w:t>
       </w:r>
       <w:r>
         <w:t xml:space="preserve"> Shift model exposes a combined clients string and a single profile object; report submit payload sends shiftRosterId + form fields with no clientId selector.</w:t>
@@ -1468,10 +2145,10 @@
         <w:rPr>
           <w:b/>
         </w:rPr>
-        <w:t>UI:</w:t>
+        <w:t xml:space="preserve">UI: </w:t>
       </w:r>
       <w:r>
-        <w:t xml:space="preserve"> Report header displays the full clients string; trip flow is keyed by shiftId only.</w:t>
+        <w:t xml:space="preserve"> Report header displays the full clients string; trip flow is keyed by shiftId only. Figure 1 shows client as a single combined header with no selector.</w:t>
       </w:r>
     </w:p>
     <w:p>
@@ -1514,7 +2191,7 @@
         <w:pStyle w:val="ListNumber"/>
       </w:pPr>
       <w:r>
-        <w:t>Start/save a transport trip for the same shift.</w:t>
+        <w:t>Start/save a transport trip for the same shift (transport control in Figure 1).</w:t>
       </w:r>
     </w:p>
     <w:p>
@@ -1523,6 +2200,14 @@
       </w:pPr>
       <w:r>
         <w:t>Observe that the trip is not attributed to a specific client.</w:t>
+      </w:r>
+    </w:p>
+    <w:p>
+      <w:pPr>
+        <w:pStyle w:val="ListNumber"/>
+      </w:pPr>
+      <w:r>
+        <w:t>Capture report and trip screens and attach as additional figures on retest.</w:t>
       </w:r>
     </w:p>
     <w:p>
@@ -1748,7 +2433,7 @@
               <w:rPr>
                 <w:sz w:val="20"/>
               </w:rPr>
-              <w:t>Before start, during active, after end — only mid-shift allows trip.</w:t>
+              <w:t>Before start, during active, after end — only mid-shift allows trip. Compare to Figure 1.</w:t>
             </w:r>
           </w:p>
         </w:tc>
@@ -1789,7 +2474,7 @@
               <w:rPr>
                 <w:sz w:val="20"/>
               </w:rPr>
-              <w:t>Create Sydney-afternoon shift; verify day, times, In Progress, and clock-in on a device set to a non-AU timezone.</w:t>
+              <w:t>Create Sydney-afternoon shift; verify day, times, In Progress, and clock-in on a device set to a non-AU timezone. Compare Figures 1–3.</w:t>
             </w:r>
           </w:p>
         </w:tc>
@@ -1830,7 +2515,7 @@
               <w:rPr>
                 <w:sz w:val="20"/>
               </w:rPr>
-              <w:t>Upload JPEG, PNG, and camera photo for a required document type.</w:t>
+              <w:t>Upload JPEG, PNG, and camera photo for a required document type. Attach new screenshot.</w:t>
             </w:r>
           </w:p>
         </w:tc>
@@ -1871,7 +2556,7 @@
               <w:rPr>
                 <w:sz w:val="20"/>
               </w:rPr>
-              <w:t>Multi-client shift: submit two reports and two trips for different clients.</w:t>
+              <w:t>Multi-client shift: submit two reports and two trips for different clients. Attach screenshots.</w:t>
             </w:r>
           </w:p>
         </w:tc>
@@ -1886,7 +2571,221 @@
         <w:rPr>
           <w:color w:val="030637"/>
         </w:rPr>
-        <w:t>8. Sign-Off</w:t>
+        <w:t>8. Appendix A — Embedded Screenshots</w:t>
+      </w:r>
+    </w:p>
+    <w:p>
+      <w:r>
+        <w:t>The following figures are the original test captures. They are also placed inline under BUG-01 and BUG-02. BUG-03 and BUG-04 had no screenshot attached at the time of this report.</w:t>
+      </w:r>
+    </w:p>
+    <w:p>
+      <w:pPr>
+        <w:jc w:val="left"/>
+      </w:pPr>
+      <w:r>
+        <w:rPr>
+          <w:b/>
+          <w:color w:val="030637"/>
+          <w:sz w:val="22"/>
+        </w:rPr>
+        <w:t>Figure 1 — Staff shift detail — Not Started, transport control visible</w:t>
+      </w:r>
+    </w:p>
+    <w:p>
+      <w:pPr>
+        <w:jc w:val="center"/>
+      </w:pPr>
+      <w:r>
+        <w:drawing>
+          <wp:inline xmlns:a="http://schemas.openxmlformats.org/drawingml/2006/main" xmlns:pic="http://schemas.openxmlformats.org/drawingml/2006/picture">
+            <wp:extent cx="2148840" cy="4654002"/>
+            <wp:docPr id="5" name="Picture 5"/>
+            <wp:cNvGraphicFramePr>
+              <a:graphicFrameLocks noChangeAspect="1"/>
+            </wp:cNvGraphicFramePr>
+            <a:graphic>
+              <a:graphicData uri="http://schemas.openxmlformats.org/drawingml/2006/picture">
+                <pic:pic>
+                  <pic:nvPicPr>
+                    <pic:cNvPr id="0" name="fig-01-shift-detail-not-started.jpg"/>
+                    <pic:cNvPicPr/>
+                  </pic:nvPicPr>
+                  <pic:blipFill>
+                    <a:blip r:embed="rId9"/>
+                    <a:stretch>
+                      <a:fillRect/>
+                    </a:stretch>
+                  </pic:blipFill>
+                  <pic:spPr>
+                    <a:xfrm>
+                      <a:off x="0" y="0"/>
+                      <a:ext cx="2148840" cy="4654002"/>
+                    </a:xfrm>
+                    <a:prstGeom prst="rect"/>
+                  </pic:spPr>
+                </pic:pic>
+              </a:graphicData>
+            </a:graphic>
+          </wp:inline>
+        </w:drawing>
+      </w:r>
+    </w:p>
+    <w:p>
+      <w:pPr>
+        <w:spacing w:after="240"/>
+        <w:jc w:val="left"/>
+      </w:pPr>
+      <w:r>
+        <w:rPr>
+          <w:i/>
+          <w:color w:val="444444"/>
+          <w:sz w:val="18"/>
+        </w:rPr>
+        <w:t>Staff mobile shift detail for client Ajeh Wumi Tao (staff Serah Adeniyi). Date shows 3 October 2026, start 4:15 PM / end 5:18 PM. Status is “Not Started” with message “Your shift hasn't started yet.” Transport (steering wheel) button is still visible. CTA is “Request to Cancel Shift”; clock-in is not offered.</w:t>
+      </w:r>
+    </w:p>
+    <w:p>
+      <w:pPr>
+        <w:jc w:val="left"/>
+      </w:pPr>
+      <w:r>
+        <w:rPr>
+          <w:b/>
+          <w:color w:val="030637"/>
+          <w:sz w:val="22"/>
+        </w:rPr>
+        <w:t>Figure 2 — Admin Schedule Board — same shift In Progress (Sydney)</w:t>
+      </w:r>
+    </w:p>
+    <w:p>
+      <w:pPr>
+        <w:jc w:val="center"/>
+      </w:pPr>
+      <w:r>
+        <w:drawing>
+          <wp:inline xmlns:a="http://schemas.openxmlformats.org/drawingml/2006/main" xmlns:pic="http://schemas.openxmlformats.org/drawingml/2006/picture">
+            <wp:extent cx="3291840" cy="5078839"/>
+            <wp:docPr id="6" name="Picture 6"/>
+            <wp:cNvGraphicFramePr>
+              <a:graphicFrameLocks noChangeAspect="1"/>
+            </wp:cNvGraphicFramePr>
+            <a:graphic>
+              <a:graphicData uri="http://schemas.openxmlformats.org/drawingml/2006/picture">
+                <pic:pic>
+                  <pic:nvPicPr>
+                    <pic:cNvPr id="0" name="fig-02-admin-schedule-board.jpg"/>
+                    <pic:cNvPicPr/>
+                  </pic:nvPicPr>
+                  <pic:blipFill>
+                    <a:blip r:embed="rId10"/>
+                    <a:stretch>
+                      <a:fillRect/>
+                    </a:stretch>
+                  </pic:blipFill>
+                  <pic:spPr>
+                    <a:xfrm>
+                      <a:off x="0" y="0"/>
+                      <a:ext cx="3291840" cy="5078839"/>
+                    </a:xfrm>
+                    <a:prstGeom prst="rect"/>
+                  </pic:spPr>
+                </pic:pic>
+              </a:graphicData>
+            </a:graphic>
+          </wp:inline>
+        </w:drawing>
+      </w:r>
+    </w:p>
+    <w:p>
+      <w:pPr>
+        <w:spacing w:after="240"/>
+        <w:jc w:val="left"/>
+      </w:pPr>
+      <w:r>
+        <w:rPr>
+          <w:i/>
+          <w:color w:val="444444"/>
+          <w:sz w:val="18"/>
+        </w:rPr>
+        <w:t>ProMax Care web Schedule Board at app.promaxcare.com.au (header 4:17:31 pm – Sydney, AU). Saturday 3 October 2026, 4:15 PM – 5:18 PM for staff Serah Adeniyi / client Ajeh Wumi Tao is shown as “In Progress” with activities Transport, Install phone, Personal Support.</w:t>
+      </w:r>
+    </w:p>
+    <w:p>
+      <w:pPr>
+        <w:jc w:val="left"/>
+      </w:pPr>
+      <w:r>
+        <w:rPr>
+          <w:b/>
+          <w:color w:val="030637"/>
+          <w:sz w:val="22"/>
+        </w:rPr>
+        <w:t>Figure 3 — Staff roster dashboard — shift listed on 4 October</w:t>
+      </w:r>
+    </w:p>
+    <w:p>
+      <w:pPr>
+        <w:jc w:val="center"/>
+      </w:pPr>
+      <w:r>
+        <w:drawing>
+          <wp:inline xmlns:a="http://schemas.openxmlformats.org/drawingml/2006/main" xmlns:pic="http://schemas.openxmlformats.org/drawingml/2006/picture">
+            <wp:extent cx="2148840" cy="4654002"/>
+            <wp:docPr id="7" name="Picture 7"/>
+            <wp:cNvGraphicFramePr>
+              <a:graphicFrameLocks noChangeAspect="1"/>
+            </wp:cNvGraphicFramePr>
+            <a:graphic>
+              <a:graphicData uri="http://schemas.openxmlformats.org/drawingml/2006/picture">
+                <pic:pic>
+                  <pic:nvPicPr>
+                    <pic:cNvPr id="0" name="fig-03-staff-roster-4-oct.jpg"/>
+                    <pic:cNvPicPr/>
+                  </pic:nvPicPr>
+                  <pic:blipFill>
+                    <a:blip r:embed="rId11"/>
+                    <a:stretch>
+                      <a:fillRect/>
+                    </a:stretch>
+                  </pic:blipFill>
+                  <pic:spPr>
+                    <a:xfrm>
+                      <a:off x="0" y="0"/>
+                      <a:ext cx="2148840" cy="4654002"/>
+                    </a:xfrm>
+                    <a:prstGeom prst="rect"/>
+                  </pic:spPr>
+                </pic:pic>
+              </a:graphicData>
+            </a:graphic>
+          </wp:inline>
+        </w:drawing>
+      </w:r>
+    </w:p>
+    <w:p>
+      <w:pPr>
+        <w:spacing w:after="240"/>
+        <w:jc w:val="left"/>
+      </w:pPr>
+      <w:r>
+        <w:rPr>
+          <w:i/>
+          <w:color w:val="444444"/>
+          <w:sz w:val="18"/>
+        </w:rPr>
+        <w:t>Staff mobile Shift Roster for Serah. Calendar selects Sunday 4 October 2026. The same client/activities card shows 1:15 AM – 3:18 AM with status ACTIVE, instead of Saturday 3 October 4:15 PM – 5:18 PM Australian time.</w:t>
+      </w:r>
+    </w:p>
+    <w:p>
+      <w:pPr>
+        <w:pStyle w:val="Heading1"/>
+      </w:pPr>
+      <w:r>
+        <w:rPr>
+          <w:color w:val="030637"/>
+        </w:rPr>
+        <w:t>9. Sign-Off</w:t>
       </w:r>
     </w:p>
     <w:tbl>
@@ -2127,8 +3026,9 @@
       <w:r>
         <w:rPr>
           <w:i/>
+          <w:sz w:val="18"/>
         </w:rPr>
-        <w:t>Attachments: Staff roster (Oct 4 display), shift detail (Not Started + transport), admin Schedule Board (In Progress, Sydney). Screenshots retained with this report.</w:t>
+        <w:t>Document format: Microsoft Word (.docx). Embedded files: fig-01-shift-detail-not-started.jpg, fig-02-admin-schedule-board.jpg, fig-03-staff-roster-4-oct.jpg (docs/screenshots/).</w:t>
       </w:r>
     </w:p>
     <w:sectPr>

</xml_diff>

<commit_message>
docs: add BUG-03 and BUG-04 screenshots to testing report
Embed Figure 4 (Add a document — PDF/DOC only), Figure 5 (Edit Shift
Report with two clients, no selector), and Figure 6 (completed
multi-client shift with trip still available).

Co-authored-by: promaxsolutions <promaxsolutions@users.noreply.github.com>
</commit_message>
<xml_diff>
--- a/docs/Promax_Care_Testing_Report.docx
+++ b/docs/Promax_Care_Testing_Report.docx
@@ -52,7 +52,7 @@
     </w:p>
     <w:p>
       <w:r>
-        <w:t>This short testing report documents four defects observed during staff shift operations on the Promax Care mobile application. Issues were reproduced against a live shift for staff Serah Adeniyi and client Ajeh Wumi Tao (3 October 2026, 4:15 PM – 5:18 PM Australian time). Evidence is attached as embedded screenshots (Figure 1–3) captured from the staff mobile app and the admin Schedule Board.</w:t>
+        <w:t>This short testing report documents four defects observed during staff shift operations on the Promax Care mobile application. Issues were reproduced against a live shift for staff Serah Adeniyi and client Ajeh Wumi Tao (3 October 2026, 4:15 PM – 5:18 PM Australian time). Evidence is attached as embedded screenshots (Figures 1–6) captured from the staff mobile app and the admin Schedule Board.</w:t>
       </w:r>
     </w:p>
     <w:tbl>
@@ -213,7 +213,7 @@
               <w:rPr>
                 <w:sz w:val="20"/>
               </w:rPr>
-              <w:t>Figure 1</w:t>
+              <w:t>Figures 1, 6</w:t>
             </w:r>
           </w:p>
         </w:tc>
@@ -347,7 +347,7 @@
               <w:rPr>
                 <w:sz w:val="20"/>
               </w:rPr>
-              <w:t>None provided</w:t>
+              <w:t>Figure 4</w:t>
             </w:r>
           </w:p>
         </w:tc>
@@ -414,7 +414,7 @@
               <w:rPr>
                 <w:sz w:val="20"/>
               </w:rPr>
-              <w:t>None provided</w:t>
+              <w:t>Figures 5, 6</w:t>
             </w:r>
           </w:p>
         </w:tc>
@@ -955,6 +955,129 @@
           </w:p>
         </w:tc>
       </w:tr>
+      <w:tr>
+        <w:tc>
+          <w:tcPr>
+            <w:tcW w:type="dxa" w:w="3216"/>
+          </w:tcPr>
+          <w:p>
+            <w:r>
+              <w:rPr>
+                <w:sz w:val="20"/>
+              </w:rPr>
+              <w:t>Figure 4</w:t>
+            </w:r>
+          </w:p>
+        </w:tc>
+        <w:tc>
+          <w:tcPr>
+            <w:tcW w:type="dxa" w:w="3216"/>
+          </w:tcPr>
+          <w:p>
+            <w:r>
+              <w:rPr>
+                <w:sz w:val="20"/>
+              </w:rPr>
+              <w:t>Staff mobile — Add a document</w:t>
+            </w:r>
+          </w:p>
+        </w:tc>
+        <w:tc>
+          <w:tcPr>
+            <w:tcW w:type="dxa" w:w="3216"/>
+          </w:tcPr>
+          <w:p>
+            <w:r>
+              <w:rPr>
+                <w:sz w:val="20"/>
+              </w:rPr>
+              <w:t>Upload File accepts only .pdf, .doc, .docx — no images</w:t>
+            </w:r>
+          </w:p>
+        </w:tc>
+      </w:tr>
+      <w:tr>
+        <w:tc>
+          <w:tcPr>
+            <w:tcW w:type="dxa" w:w="3216"/>
+          </w:tcPr>
+          <w:p>
+            <w:r>
+              <w:rPr>
+                <w:sz w:val="20"/>
+              </w:rPr>
+              <w:t>Figure 5</w:t>
+            </w:r>
+          </w:p>
+        </w:tc>
+        <w:tc>
+          <w:tcPr>
+            <w:tcW w:type="dxa" w:w="3216"/>
+          </w:tcPr>
+          <w:p>
+            <w:r>
+              <w:rPr>
+                <w:sz w:val="20"/>
+              </w:rPr>
+              <w:t>Staff mobile — Edit Shift Report</w:t>
+            </w:r>
+          </w:p>
+        </w:tc>
+        <w:tc>
+          <w:tcPr>
+            <w:tcW w:type="dxa" w:w="3216"/>
+          </w:tcPr>
+          <w:p>
+            <w:r>
+              <w:rPr>
+                <w:sz w:val="20"/>
+              </w:rPr>
+              <w:t>Client’s Name: Ajeh Wumi Tao, Olatunji John — one report, no picker</w:t>
+            </w:r>
+          </w:p>
+        </w:tc>
+      </w:tr>
+      <w:tr>
+        <w:tc>
+          <w:tcPr>
+            <w:tcW w:type="dxa" w:w="3216"/>
+          </w:tcPr>
+          <w:p>
+            <w:r>
+              <w:rPr>
+                <w:sz w:val="20"/>
+              </w:rPr>
+              <w:t>Figure 6</w:t>
+            </w:r>
+          </w:p>
+        </w:tc>
+        <w:tc>
+          <w:tcPr>
+            <w:tcW w:type="dxa" w:w="3216"/>
+          </w:tcPr>
+          <w:p>
+            <w:r>
+              <w:rPr>
+                <w:sz w:val="20"/>
+              </w:rPr>
+              <w:t>Staff mobile — shift detail (completed)</w:t>
+            </w:r>
+          </w:p>
+        </w:tc>
+        <w:tc>
+          <w:tcPr>
+            <w:tcW w:type="dxa" w:w="3216"/>
+          </w:tcPr>
+          <w:p>
+            <w:r>
+              <w:rPr>
+                <w:sz w:val="20"/>
+              </w:rPr>
+              <w:t>Two clients combined; Shift Completed; transport button still shown</w:t>
+            </w:r>
+          </w:p>
+        </w:tc>
+      </w:tr>
     </w:tbl>
     <w:p/>
     <w:p>
@@ -990,7 +1113,7 @@
         <w:t xml:space="preserve">Screenshot reference: </w:t>
       </w:r>
       <w:r>
-        <w:t>Figure 1</w:t>
+        <w:t>Figure 1 (before start); Figure 6 (after shift completed)</w:t>
       </w:r>
     </w:p>
     <w:p>
@@ -1028,10 +1151,24 @@
         <w:rPr>
           <w:b/>
         </w:rPr>
-        <w:t xml:space="preserve">Observed: </w:t>
+        <w:t xml:space="preserve">Before start: </w:t>
       </w:r>
       <w:r>
         <w:t xml:space="preserve"> Shift detail shows status “Not Started” and “Your shift hasn't started yet. You can request to cancel if needed.” The transport (steering wheel) control remains visible and usable (Figure 1).</w:t>
+      </w:r>
+    </w:p>
+    <w:p>
+      <w:pPr>
+        <w:pStyle w:val="ListBullet"/>
+      </w:pPr>
+      <w:r>
+        <w:rPr>
+          <w:b/>
+        </w:rPr>
+        <w:t xml:space="preserve">After end: </w:t>
+      </w:r>
+      <w:r>
+        <w:t xml:space="preserve"> A later completed shift for two clients still shows “Shift Completed” while the transport button remains on screen (Figure 6).</w:t>
       </w:r>
     </w:p>
     <w:p>
@@ -1116,6 +1253,72 @@
     </w:p>
     <w:p>
       <w:pPr>
+        <w:jc w:val="left"/>
+      </w:pPr>
+      <w:r>
+        <w:rPr>
+          <w:b/>
+          <w:color w:val="030637"/>
+          <w:sz w:val="22"/>
+        </w:rPr>
+        <w:t>Figure 6 — Completed multi-client shift — trip control still available</w:t>
+      </w:r>
+    </w:p>
+    <w:p>
+      <w:pPr>
+        <w:jc w:val="center"/>
+      </w:pPr>
+      <w:r>
+        <w:drawing>
+          <wp:inline xmlns:a="http://schemas.openxmlformats.org/drawingml/2006/main" xmlns:pic="http://schemas.openxmlformats.org/drawingml/2006/picture">
+            <wp:extent cx="2148840" cy="4654002"/>
+            <wp:docPr id="2" name="Picture 2"/>
+            <wp:cNvGraphicFramePr>
+              <a:graphicFrameLocks noChangeAspect="1"/>
+            </wp:cNvGraphicFramePr>
+            <a:graphic>
+              <a:graphicData uri="http://schemas.openxmlformats.org/drawingml/2006/picture">
+                <pic:pic>
+                  <pic:nvPicPr>
+                    <pic:cNvPr id="0" name="fig-06-completed-shift-multi-client-trip.jpg"/>
+                    <pic:cNvPicPr/>
+                  </pic:nvPicPr>
+                  <pic:blipFill>
+                    <a:blip r:embed="rId10"/>
+                    <a:stretch>
+                      <a:fillRect/>
+                    </a:stretch>
+                  </pic:blipFill>
+                  <pic:spPr>
+                    <a:xfrm>
+                      <a:off x="0" y="0"/>
+                      <a:ext cx="2148840" cy="4654002"/>
+                    </a:xfrm>
+                    <a:prstGeom prst="rect"/>
+                  </pic:spPr>
+                </pic:pic>
+              </a:graphicData>
+            </a:graphic>
+          </wp:inline>
+        </w:drawing>
+      </w:r>
+    </w:p>
+    <w:p>
+      <w:pPr>
+        <w:spacing w:after="240"/>
+        <w:jc w:val="left"/>
+      </w:pPr>
+      <w:r>
+        <w:rPr>
+          <w:i/>
+          <w:color w:val="444444"/>
+          <w:sz w:val="18"/>
+        </w:rPr>
+        <w:t>Shift detail for clients “David David David, Fateru Israel Oluwapelumi” (staff Serah Adeniyi). Status is “Shift Completed” with message “Great job! Your shift has been completed successfully.” Activities include Transport. The steering-wheel trip button remains visible. There is no client selector for which participant a trip would cover.</w:t>
+      </w:r>
+    </w:p>
+    <w:p>
+      <w:pPr>
         <w:pStyle w:val="Heading2"/>
       </w:pPr>
       <w:r>
@@ -1130,7 +1333,7 @@
         <w:pStyle w:val="ListNumber"/>
       </w:pPr>
       <w:r>
-        <w:t>Open a shift that includes the Transport activity (see Figure 1).</w:t>
+        <w:t>Open a shift that includes the Transport activity (see Figure 1 before start, Figure 6 after complete).</w:t>
       </w:r>
     </w:p>
     <w:p>
@@ -1138,7 +1341,7 @@
         <w:pStyle w:val="ListNumber"/>
       </w:pPr>
       <w:r>
-        <w:t>Confirm shift status is Not Started / Upcoming (before start), or ended/Absent/Present (after end).</w:t>
+        <w:t>Confirm shift status is Not Started / Upcoming (before start), or Shift Completed / Absent / Present (after end).</w:t>
       </w:r>
     </w:p>
     <w:p>
@@ -1146,7 +1349,7 @@
         <w:pStyle w:val="ListNumber"/>
       </w:pPr>
       <w:r>
-        <w:t>Tap the transport / trip control on the shift detail screen (steering-wheel button in Figure 1).</w:t>
+        <w:t>Tap the transport / trip control (steering-wheel button in Figures 1 and 6).</w:t>
       </w:r>
     </w:p>
     <w:p>
@@ -1236,7 +1439,7 @@
               <w:rPr>
                 <w:sz w:val="20"/>
               </w:rPr>
-              <w:t>Trip control available before start (Figure 1) and after shift has passed.</w:t>
+              <w:t>Trip control available before start (Figure 1) and after the shift is completed (Figure 6).</w:t>
             </w:r>
           </w:p>
         </w:tc>
@@ -1394,7 +1597,7 @@
         <w:drawing>
           <wp:inline xmlns:a="http://schemas.openxmlformats.org/drawingml/2006/main" xmlns:pic="http://schemas.openxmlformats.org/drawingml/2006/picture">
             <wp:extent cx="3291840" cy="5078839"/>
-            <wp:docPr id="2" name="Picture 2"/>
+            <wp:docPr id="3" name="Picture 3"/>
             <wp:cNvGraphicFramePr>
               <a:graphicFrameLocks noChangeAspect="1"/>
             </wp:cNvGraphicFramePr>
@@ -1406,7 +1609,7 @@
                     <pic:cNvPicPr/>
                   </pic:nvPicPr>
                   <pic:blipFill>
-                    <a:blip r:embed="rId10"/>
+                    <a:blip r:embed="rId11"/>
                     <a:stretch>
                       <a:fillRect/>
                     </a:stretch>
@@ -1471,7 +1674,7 @@
         <w:drawing>
           <wp:inline xmlns:a="http://schemas.openxmlformats.org/drawingml/2006/main" xmlns:pic="http://schemas.openxmlformats.org/drawingml/2006/picture">
             <wp:extent cx="2148840" cy="4654002"/>
-            <wp:docPr id="3" name="Picture 3"/>
+            <wp:docPr id="4" name="Picture 4"/>
             <wp:cNvGraphicFramePr>
               <a:graphicFrameLocks noChangeAspect="1"/>
             </wp:cNvGraphicFramePr>
@@ -1483,7 +1686,7 @@
                     <pic:cNvPicPr/>
                   </pic:nvPicPr>
                   <pic:blipFill>
-                    <a:blip r:embed="rId11"/>
+                    <a:blip r:embed="rId12"/>
                     <a:stretch>
                       <a:fillRect/>
                     </a:stretch>
@@ -1548,7 +1751,7 @@
         <w:drawing>
           <wp:inline xmlns:a="http://schemas.openxmlformats.org/drawingml/2006/main" xmlns:pic="http://schemas.openxmlformats.org/drawingml/2006/picture">
             <wp:extent cx="2148840" cy="4654002"/>
-            <wp:docPr id="4" name="Picture 4"/>
+            <wp:docPr id="5" name="Picture 5"/>
             <wp:cNvGraphicFramePr>
               <a:graphicFrameLocks noChangeAspect="1"/>
             </wp:cNvGraphicFramePr>
@@ -1870,7 +2073,7 @@
         <w:t xml:space="preserve">Screenshot reference: </w:t>
       </w:r>
       <w:r>
-        <w:t>None provided for this defect. Reproduce and attach picker/error screen on retest.</w:t>
+        <w:t>Figure 4</w:t>
       </w:r>
     </w:p>
     <w:p>
@@ -1897,7 +2100,7 @@
         <w:rPr>
           <w:color w:val="030637"/>
         </w:rPr>
-        <w:t>5.2 Evidence / Technical Note</w:t>
+        <w:t>5.2 Evidence</w:t>
       </w:r>
     </w:p>
     <w:p>
@@ -1908,10 +2111,10 @@
         <w:rPr>
           <w:b/>
         </w:rPr>
-        <w:t xml:space="preserve">Picker types: </w:t>
+        <w:t xml:space="preserve">Observed: </w:t>
       </w:r>
       <w:r>
-        <w:t xml:space="preserve"> Upload uses DocumentPicker with a limited MIME list: image/jpeg, application/pdf, and Word types only. image/png (and broader image/*) are not included.</w:t>
+        <w:t xml:space="preserve"> The “Add a document” screen labels Upload File as “Tap to select file (.pdf, .doc, .docx)”. No image types are listed (Figure 4).</w:t>
       </w:r>
     </w:p>
     <w:p>
@@ -1922,10 +2125,76 @@
         <w:rPr>
           <w:b/>
         </w:rPr>
-        <w:t xml:space="preserve">UX gap: </w:t>
+        <w:t xml:space="preserve">Code / UX note: </w:t>
       </w:r>
       <w:r>
-        <w:t xml:space="preserve"> There is no ImagePicker / camera path on the document forms (unlike profile photo), so many phone photos (often PNG/HEIC) cannot be selected reliably.</w:t>
+        <w:t xml:space="preserve"> Upload uses DocumentPicker with a limited MIME list: image/jpeg, application/pdf, and Word types only. The on-screen hint omits images entirely. image/png and camera/gallery paths are not offered (unlike profile photo).</w:t>
+      </w:r>
+    </w:p>
+    <w:p>
+      <w:pPr>
+        <w:jc w:val="left"/>
+      </w:pPr>
+      <w:r>
+        <w:rPr>
+          <w:b/>
+          <w:color w:val="030637"/>
+          <w:sz w:val="22"/>
+        </w:rPr>
+        <w:t>Figure 4 — Add a document — file types limited to PDF and Word</w:t>
+      </w:r>
+    </w:p>
+    <w:p>
+      <w:pPr>
+        <w:jc w:val="center"/>
+      </w:pPr>
+      <w:r>
+        <w:drawing>
+          <wp:inline xmlns:a="http://schemas.openxmlformats.org/drawingml/2006/main" xmlns:pic="http://schemas.openxmlformats.org/drawingml/2006/picture">
+            <wp:extent cx="2148840" cy="4654002"/>
+            <wp:docPr id="6" name="Picture 6"/>
+            <wp:cNvGraphicFramePr>
+              <a:graphicFrameLocks noChangeAspect="1"/>
+            </wp:cNvGraphicFramePr>
+            <a:graphic>
+              <a:graphicData uri="http://schemas.openxmlformats.org/drawingml/2006/picture">
+                <pic:pic>
+                  <pic:nvPicPr>
+                    <pic:cNvPr id="0" name="fig-04-add-document-no-images.jpg"/>
+                    <pic:cNvPicPr/>
+                  </pic:nvPicPr>
+                  <pic:blipFill>
+                    <a:blip r:embed="rId13"/>
+                    <a:stretch>
+                      <a:fillRect/>
+                    </a:stretch>
+                  </pic:blipFill>
+                  <pic:spPr>
+                    <a:xfrm>
+                      <a:off x="0" y="0"/>
+                      <a:ext cx="2148840" cy="4654002"/>
+                    </a:xfrm>
+                    <a:prstGeom prst="rect"/>
+                  </pic:spPr>
+                </pic:pic>
+              </a:graphicData>
+            </a:graphic>
+          </wp:inline>
+        </w:drawing>
+      </w:r>
+    </w:p>
+    <w:p>
+      <w:pPr>
+        <w:spacing w:after="240"/>
+        <w:jc w:val="left"/>
+      </w:pPr>
+      <w:r>
+        <w:rPr>
+          <w:i/>
+          <w:color w:val="444444"/>
+          <w:sz w:val="18"/>
+        </w:rPr>
+        <w:t>Staff “Add a document” screen. The Upload File control reads “Tap to select file (.pdf, .doc, .docx)”. Image formats (JPEG, PNG, HEIC) are not listed or offered.</w:t>
       </w:r>
     </w:p>
     <w:p>
@@ -1944,7 +2213,7 @@
         <w:pStyle w:val="ListNumber"/>
       </w:pPr>
       <w:r>
-        <w:t>Open Documents tab → Add / upload a compliance document.</w:t>
+        <w:t>Open Documents tab → Add a document (Figure 4).</w:t>
       </w:r>
     </w:p>
     <w:p>
@@ -1952,7 +2221,7 @@
         <w:pStyle w:val="ListNumber"/>
       </w:pPr>
       <w:r>
-        <w:t>Attempt to select a PNG, HEIC, or gallery photo of a certificate.</w:t>
+        <w:t>Confirm the upload hint lists only .pdf, .doc, .docx.</w:t>
       </w:r>
     </w:p>
     <w:p>
@@ -1960,7 +2229,7 @@
         <w:pStyle w:val="ListNumber"/>
       </w:pPr>
       <w:r>
-        <w:t>Observe that the image is rejected, unavailable in the picker, or fails upload.</w:t>
+        <w:t>Tap “Tap to select file” and attempt to choose a JPEG, PNG, HEIC, or camera photo.</w:t>
       </w:r>
     </w:p>
     <w:p>
@@ -1968,15 +2237,7 @@
         <w:pStyle w:val="ListNumber"/>
       </w:pPr>
       <w:r>
-        <w:t>Capture the picker/error screen and attach as Figure 4 on retest.</w:t>
-      </w:r>
-    </w:p>
-    <w:p>
-      <w:pPr>
-        <w:pStyle w:val="ListNumber"/>
-      </w:pPr>
-      <w:r>
-        <w:t>Retry with PDF (if available) to confirm non-image types still work.</w:t>
+        <w:t>Observe that images are not offered or cannot be submitted as a compliance document.</w:t>
       </w:r>
     </w:p>
     <w:p>
@@ -1998,13 +2259,14 @@
         <w:tblLook w:firstColumn="1" w:firstRow="1" w:lastColumn="0" w:lastRow="0" w:noHBand="0" w:noVBand="1" w:val="04A0"/>
       </w:tblPr>
       <w:tblGrid>
-        <w:gridCol w:w="4824"/>
-        <w:gridCol w:w="4824"/>
+        <w:gridCol w:w="3216"/>
+        <w:gridCol w:w="3216"/>
+        <w:gridCol w:w="3216"/>
       </w:tblGrid>
       <w:tr>
         <w:tc>
           <w:tcPr>
-            <w:tcW w:type="dxa" w:w="4824"/>
+            <w:tcW w:type="dxa" w:w="3216"/>
             <w:shd w:fill="030637" w:val="clear"/>
           </w:tcPr>
           <w:p>
@@ -2020,7 +2282,7 @@
         </w:tc>
         <w:tc>
           <w:tcPr>
-            <w:tcW w:type="dxa" w:w="4824"/>
+            <w:tcW w:type="dxa" w:w="3216"/>
             <w:shd w:fill="030637" w:val="clear"/>
           </w:tcPr>
           <w:p>
@@ -2034,31 +2296,60 @@
             </w:r>
           </w:p>
         </w:tc>
+        <w:tc>
+          <w:tcPr>
+            <w:tcW w:type="dxa" w:w="3216"/>
+            <w:shd w:fill="030637" w:val="clear"/>
+          </w:tcPr>
+          <w:p>
+            <w:r>
+              <w:rPr>
+                <w:b/>
+                <w:color w:val="FFFFFF"/>
+                <w:sz w:val="20"/>
+              </w:rPr>
+              <w:t>Evidence</w:t>
+            </w:r>
+          </w:p>
+        </w:tc>
       </w:tr>
       <w:tr>
         <w:tc>
           <w:tcPr>
-            <w:tcW w:type="dxa" w:w="4824"/>
+            <w:tcW w:type="dxa" w:w="3216"/>
           </w:tcPr>
           <w:p>
             <w:r>
               <w:rPr>
                 <w:sz w:val="20"/>
               </w:rPr>
-              <w:t>Staff can upload common image formats (JPEG, PNG; ideally HEIC via conversion) and PDF for compliance documents.</w:t>
+              <w:t>Staff can upload common image formats (JPEG, PNG; ideally HEIC via conversion) and PDF/Word for compliance documents.</w:t>
             </w:r>
           </w:p>
         </w:tc>
         <w:tc>
           <w:tcPr>
-            <w:tcW w:type="dxa" w:w="4824"/>
+            <w:tcW w:type="dxa" w:w="3216"/>
           </w:tcPr>
           <w:p>
             <w:r>
               <w:rPr>
                 <w:sz w:val="20"/>
               </w:rPr>
-              <w:t>Images are not accepted reliably; picker/MIME allow-list is too narrow.</w:t>
+              <w:t>Upload File hint allows only .pdf, .doc, .docx. Images are not accepted.</w:t>
+            </w:r>
+          </w:p>
+        </w:tc>
+        <w:tc>
+          <w:tcPr>
+            <w:tcW w:type="dxa" w:w="3216"/>
+          </w:tcPr>
+          <w:p>
+            <w:r>
+              <w:rPr>
+                <w:sz w:val="20"/>
+              </w:rPr>
+              <w:t>Figure 4</w:t>
             </w:r>
           </w:p>
         </w:tc>
@@ -2090,10 +2381,10 @@
         <w:rPr>
           <w:b/>
         </w:rPr>
-        <w:t xml:space="preserve">Screenshot reference: </w:t>
+        <w:t xml:space="preserve">Screenshot references: </w:t>
       </w:r>
       <w:r>
-        <w:t>None provided for this defect. Figure 1 shows a single-client header (Ajeh Wumi Tao). Reproduce with two+ clients and attach report/trip screens on retest.</w:t>
+        <w:t>Figure 5 (report); Figure 6 (trip on completed multi-client shift)</w:t>
       </w:r>
     </w:p>
     <w:p>
@@ -2120,7 +2411,35 @@
         <w:rPr>
           <w:color w:val="030637"/>
         </w:rPr>
-        <w:t>6.2 Evidence / Technical Note</w:t>
+        <w:t>6.2 Evidence</w:t>
+      </w:r>
+    </w:p>
+    <w:p>
+      <w:pPr>
+        <w:pStyle w:val="ListBullet"/>
+      </w:pPr>
+      <w:r>
+        <w:rPr>
+          <w:b/>
+        </w:rPr>
+        <w:t xml:space="preserve">Report: </w:t>
+      </w:r>
+      <w:r>
+        <w:t xml:space="preserve"> Edit Shift Report shows Client’s Name as “Ajeh Wumi Tao, Olatunji John” with no dropdown or picker. One report form is shared by both clients (Figure 5).</w:t>
+      </w:r>
+    </w:p>
+    <w:p>
+      <w:pPr>
+        <w:pStyle w:val="ListBullet"/>
+      </w:pPr>
+      <w:r>
+        <w:rPr>
+          <w:b/>
+        </w:rPr>
+        <w:t xml:space="preserve">Trip: </w:t>
+      </w:r>
+      <w:r>
+        <w:t xml:space="preserve"> Shift detail header concatenates two clients (“David David David, Fateru Israel Oluwapelumi”). Transport remains a single shift-level button even after completion (Figure 6). There is no client selector for the trip.</w:t>
       </w:r>
     </w:p>
     <w:p>
@@ -2139,16 +2458,156 @@
     </w:p>
     <w:p>
       <w:pPr>
-        <w:pStyle w:val="ListBullet"/>
+        <w:pStyle w:val="Heading3"/>
+      </w:pPr>
+      <w:r>
+        <w:rPr>
+          <w:color w:val="030637"/>
+        </w:rPr>
+        <w:t>6.2.1 One report tied to two clients</w:t>
+      </w:r>
+    </w:p>
+    <w:p>
+      <w:pPr>
+        <w:jc w:val="left"/>
       </w:pPr>
       <w:r>
         <w:rPr>
           <w:b/>
+          <w:color w:val="030637"/>
+          <w:sz w:val="22"/>
         </w:rPr>
-        <w:t xml:space="preserve">UI: </w:t>
+        <w:t>Figure 5 — Edit Shift Report — two clients on one report, no selector</w:t>
       </w:r>
+    </w:p>
+    <w:p>
+      <w:pPr>
+        <w:jc w:val="center"/>
+      </w:pPr>
       <w:r>
-        <w:t xml:space="preserve"> Report header displays the full clients string; trip flow is keyed by shiftId only. Figure 1 shows client as a single combined header with no selector.</w:t>
+        <w:drawing>
+          <wp:inline xmlns:a="http://schemas.openxmlformats.org/drawingml/2006/main" xmlns:pic="http://schemas.openxmlformats.org/drawingml/2006/picture">
+            <wp:extent cx="2148840" cy="4654002"/>
+            <wp:docPr id="7" name="Picture 7"/>
+            <wp:cNvGraphicFramePr>
+              <a:graphicFrameLocks noChangeAspect="1"/>
+            </wp:cNvGraphicFramePr>
+            <a:graphic>
+              <a:graphicData uri="http://schemas.openxmlformats.org/drawingml/2006/picture">
+                <pic:pic>
+                  <pic:nvPicPr>
+                    <pic:cNvPr id="0" name="fig-05-edit-report-two-clients.jpg"/>
+                    <pic:cNvPicPr/>
+                  </pic:nvPicPr>
+                  <pic:blipFill>
+                    <a:blip r:embed="rId14"/>
+                    <a:stretch>
+                      <a:fillRect/>
+                    </a:stretch>
+                  </pic:blipFill>
+                  <pic:spPr>
+                    <a:xfrm>
+                      <a:off x="0" y="0"/>
+                      <a:ext cx="2148840" cy="4654002"/>
+                    </a:xfrm>
+                    <a:prstGeom prst="rect"/>
+                  </pic:spPr>
+                </pic:pic>
+              </a:graphicData>
+            </a:graphic>
+          </wp:inline>
+        </w:drawing>
+      </w:r>
+    </w:p>
+    <w:p>
+      <w:pPr>
+        <w:spacing w:after="240"/>
+        <w:jc w:val="left"/>
+      </w:pPr>
+      <w:r>
+        <w:rPr>
+          <w:i/>
+          <w:color w:val="444444"/>
+          <w:sz w:val="18"/>
+        </w:rPr>
+        <w:t>Edit Shift Report for staff Serah. Client’s Name is shown as a combined string “Ajeh Wumi Tao, Olatunji John”. There is no control to choose which client the report is for. One form (urgent matters, medications, etc.) applies to both clients.</w:t>
+      </w:r>
+    </w:p>
+    <w:p>
+      <w:pPr>
+        <w:pStyle w:val="Heading3"/>
+      </w:pPr>
+      <w:r>
+        <w:rPr>
+          <w:color w:val="030637"/>
+        </w:rPr>
+        <w:t>6.2.2 One trip control for two clients (after shift completed)</w:t>
+      </w:r>
+    </w:p>
+    <w:p>
+      <w:pPr>
+        <w:jc w:val="left"/>
+      </w:pPr>
+      <w:r>
+        <w:rPr>
+          <w:b/>
+          <w:color w:val="030637"/>
+          <w:sz w:val="22"/>
+        </w:rPr>
+        <w:t>Figure 6 — Completed multi-client shift — trip control still available</w:t>
+      </w:r>
+    </w:p>
+    <w:p>
+      <w:pPr>
+        <w:jc w:val="center"/>
+      </w:pPr>
+      <w:r>
+        <w:drawing>
+          <wp:inline xmlns:a="http://schemas.openxmlformats.org/drawingml/2006/main" xmlns:pic="http://schemas.openxmlformats.org/drawingml/2006/picture">
+            <wp:extent cx="2148840" cy="4654002"/>
+            <wp:docPr id="8" name="Picture 8"/>
+            <wp:cNvGraphicFramePr>
+              <a:graphicFrameLocks noChangeAspect="1"/>
+            </wp:cNvGraphicFramePr>
+            <a:graphic>
+              <a:graphicData uri="http://schemas.openxmlformats.org/drawingml/2006/picture">
+                <pic:pic>
+                  <pic:nvPicPr>
+                    <pic:cNvPr id="0" name="fig-06-completed-shift-multi-client-trip.jpg"/>
+                    <pic:cNvPicPr/>
+                  </pic:nvPicPr>
+                  <pic:blipFill>
+                    <a:blip r:embed="rId10"/>
+                    <a:stretch>
+                      <a:fillRect/>
+                    </a:stretch>
+                  </pic:blipFill>
+                  <pic:spPr>
+                    <a:xfrm>
+                      <a:off x="0" y="0"/>
+                      <a:ext cx="2148840" cy="4654002"/>
+                    </a:xfrm>
+                    <a:prstGeom prst="rect"/>
+                  </pic:spPr>
+                </pic:pic>
+              </a:graphicData>
+            </a:graphic>
+          </wp:inline>
+        </w:drawing>
+      </w:r>
+    </w:p>
+    <w:p>
+      <w:pPr>
+        <w:spacing w:after="240"/>
+        <w:jc w:val="left"/>
+      </w:pPr>
+      <w:r>
+        <w:rPr>
+          <w:i/>
+          <w:color w:val="444444"/>
+          <w:sz w:val="18"/>
+        </w:rPr>
+        <w:t>Shift detail for clients “David David David, Fateru Israel Oluwapelumi” (staff Serah Adeniyi). Status is “Shift Completed” with message “Great job! Your shift has been completed successfully.” Activities include Transport. The steering-wheel trip button remains visible. There is no client selector for which participant a trip would cover.</w:t>
       </w:r>
     </w:p>
     <w:p>
@@ -2167,7 +2626,7 @@
         <w:pStyle w:val="ListNumber"/>
       </w:pPr>
       <w:r>
-        <w:t>Assign a shift (or scenario) with more than one client for the same staff member.</w:t>
+        <w:t>Assign a shift with more than one client for the same staff member.</w:t>
       </w:r>
     </w:p>
     <w:p>
@@ -2175,7 +2634,7 @@
         <w:pStyle w:val="ListNumber"/>
       </w:pPr>
       <w:r>
-        <w:t>Open shift report creation from the mobile app.</w:t>
+        <w:t>Open Edit/Create Shift Report and confirm Client’s Name lists both clients with no selector (Figure 5).</w:t>
       </w:r>
     </w:p>
     <w:p>
@@ -2183,7 +2642,7 @@
         <w:pStyle w:val="ListNumber"/>
       </w:pPr>
       <w:r>
-        <w:t>Observe that there is no client picker; one report covers all listed clients.</w:t>
+        <w:t>Submit or save the report and observe it is stored against the shift, not a chosen client.</w:t>
       </w:r>
     </w:p>
     <w:p>
@@ -2191,7 +2650,7 @@
         <w:pStyle w:val="ListNumber"/>
       </w:pPr>
       <w:r>
-        <w:t>Start/save a transport trip for the same shift (transport control in Figure 1).</w:t>
+        <w:t>Open shift detail for a multi-client shift that includes Transport (Figure 6).</w:t>
       </w:r>
     </w:p>
     <w:p>
@@ -2199,15 +2658,7 @@
         <w:pStyle w:val="ListNumber"/>
       </w:pPr>
       <w:r>
-        <w:t>Observe that the trip is not attributed to a specific client.</w:t>
-      </w:r>
-    </w:p>
-    <w:p>
-      <w:pPr>
-        <w:pStyle w:val="ListNumber"/>
-      </w:pPr>
-      <w:r>
-        <w:t>Capture report and trip screens and attach as additional figures on retest.</w:t>
+        <w:t>Start/save a trip via the steering-wheel control. Observe the trip is not attributed to a specific client.</w:t>
       </w:r>
     </w:p>
     <w:p>
@@ -2229,13 +2680,14 @@
         <w:tblLook w:firstColumn="1" w:firstRow="1" w:lastColumn="0" w:lastRow="0" w:noHBand="0" w:noVBand="1" w:val="04A0"/>
       </w:tblPr>
       <w:tblGrid>
-        <w:gridCol w:w="4824"/>
-        <w:gridCol w:w="4824"/>
+        <w:gridCol w:w="3216"/>
+        <w:gridCol w:w="3216"/>
+        <w:gridCol w:w="3216"/>
       </w:tblGrid>
       <w:tr>
         <w:tc>
           <w:tcPr>
-            <w:tcW w:type="dxa" w:w="4824"/>
+            <w:tcW w:type="dxa" w:w="3216"/>
             <w:shd w:fill="030637" w:val="clear"/>
           </w:tcPr>
           <w:p>
@@ -2251,7 +2703,7 @@
         </w:tc>
         <w:tc>
           <w:tcPr>
-            <w:tcW w:type="dxa" w:w="4824"/>
+            <w:tcW w:type="dxa" w:w="3216"/>
             <w:shd w:fill="030637" w:val="clear"/>
           </w:tcPr>
           <w:p>
@@ -2265,11 +2717,27 @@
             </w:r>
           </w:p>
         </w:tc>
+        <w:tc>
+          <w:tcPr>
+            <w:tcW w:type="dxa" w:w="3216"/>
+            <w:shd w:fill="030637" w:val="clear"/>
+          </w:tcPr>
+          <w:p>
+            <w:r>
+              <w:rPr>
+                <w:b/>
+                <w:color w:val="FFFFFF"/>
+                <w:sz w:val="20"/>
+              </w:rPr>
+              <w:t>Evidence</w:t>
+            </w:r>
+          </w:p>
+        </w:tc>
       </w:tr>
       <w:tr>
         <w:tc>
           <w:tcPr>
-            <w:tcW w:type="dxa" w:w="4824"/>
+            <w:tcW w:type="dxa" w:w="3216"/>
           </w:tcPr>
           <w:p>
             <w:r>
@@ -2282,14 +2750,27 @@
         </w:tc>
         <w:tc>
           <w:tcPr>
-            <w:tcW w:type="dxa" w:w="4824"/>
+            <w:tcW w:type="dxa" w:w="3216"/>
           </w:tcPr>
           <w:p>
             <w:r>
               <w:rPr>
                 <w:sz w:val="20"/>
               </w:rPr>
-              <w:t>One report is tied to all clients on the shift.</w:t>
+              <w:t>One report is tied to all clients on the shift (combined name string).</w:t>
+            </w:r>
+          </w:p>
+        </w:tc>
+        <w:tc>
+          <w:tcPr>
+            <w:tcW w:type="dxa" w:w="3216"/>
+          </w:tcPr>
+          <w:p>
+            <w:r>
+              <w:rPr>
+                <w:sz w:val="20"/>
+              </w:rPr>
+              <w:t>Figure 5</w:t>
             </w:r>
           </w:p>
         </w:tc>
@@ -2297,7 +2778,7 @@
       <w:tr>
         <w:tc>
           <w:tcPr>
-            <w:tcW w:type="dxa" w:w="4824"/>
+            <w:tcW w:type="dxa" w:w="3216"/>
           </w:tcPr>
           <w:p>
             <w:r>
@@ -2310,14 +2791,27 @@
         </w:tc>
         <w:tc>
           <w:tcPr>
-            <w:tcW w:type="dxa" w:w="4824"/>
+            <w:tcW w:type="dxa" w:w="3216"/>
           </w:tcPr>
           <w:p>
             <w:r>
               <w:rPr>
                 <w:sz w:val="20"/>
               </w:rPr>
-              <w:t>Trip is recorded against the shift only, not a chosen client.</w:t>
+              <w:t>Trip is recorded against the shift only; transport button is shift-level.</w:t>
+            </w:r>
+          </w:p>
+        </w:tc>
+        <w:tc>
+          <w:tcPr>
+            <w:tcW w:type="dxa" w:w="3216"/>
+          </w:tcPr>
+          <w:p>
+            <w:r>
+              <w:rPr>
+                <w:sz w:val="20"/>
+              </w:rPr>
+              <w:t>Figure 6</w:t>
             </w:r>
           </w:p>
         </w:tc>
@@ -2515,7 +3009,7 @@
               <w:rPr>
                 <w:sz w:val="20"/>
               </w:rPr>
-              <w:t>Upload JPEG, PNG, and camera photo for a required document type. Attach new screenshot.</w:t>
+              <w:t>Upload JPEG, PNG, and camera photo for a required document type. Compare to Figure 4.</w:t>
             </w:r>
           </w:p>
         </w:tc>
@@ -2556,7 +3050,7 @@
               <w:rPr>
                 <w:sz w:val="20"/>
               </w:rPr>
-              <w:t>Multi-client shift: submit two reports and two trips for different clients. Attach screenshots.</w:t>
+              <w:t>Multi-client shift: submit two reports and two trips for different clients. Compare to Figures 5 and 6.</w:t>
             </w:r>
           </w:p>
         </w:tc>
@@ -2576,7 +3070,7 @@
     </w:p>
     <w:p>
       <w:r>
-        <w:t>The following figures are the original test captures. They are also placed inline under BUG-01 and BUG-02. BUG-03 and BUG-04 had no screenshot attached at the time of this report.</w:t>
+        <w:t>The following figures are the original test captures. They are also placed inline under BUG-01 through BUG-04.</w:t>
       </w:r>
     </w:p>
     <w:p>
@@ -2600,7 +3094,7 @@
         <w:drawing>
           <wp:inline xmlns:a="http://schemas.openxmlformats.org/drawingml/2006/main" xmlns:pic="http://schemas.openxmlformats.org/drawingml/2006/picture">
             <wp:extent cx="2148840" cy="4654002"/>
-            <wp:docPr id="5" name="Picture 5"/>
+            <wp:docPr id="9" name="Picture 9"/>
             <wp:cNvGraphicFramePr>
               <a:graphicFrameLocks noChangeAspect="1"/>
             </wp:cNvGraphicFramePr>
@@ -2666,7 +3160,7 @@
         <w:drawing>
           <wp:inline xmlns:a="http://schemas.openxmlformats.org/drawingml/2006/main" xmlns:pic="http://schemas.openxmlformats.org/drawingml/2006/picture">
             <wp:extent cx="3291840" cy="5078839"/>
-            <wp:docPr id="6" name="Picture 6"/>
+            <wp:docPr id="10" name="Picture 10"/>
             <wp:cNvGraphicFramePr>
               <a:graphicFrameLocks noChangeAspect="1"/>
             </wp:cNvGraphicFramePr>
@@ -2678,7 +3172,7 @@
                     <pic:cNvPicPr/>
                   </pic:nvPicPr>
                   <pic:blipFill>
-                    <a:blip r:embed="rId10"/>
+                    <a:blip r:embed="rId11"/>
                     <a:stretch>
                       <a:fillRect/>
                     </a:stretch>
@@ -2732,7 +3226,7 @@
         <w:drawing>
           <wp:inline xmlns:a="http://schemas.openxmlformats.org/drawingml/2006/main" xmlns:pic="http://schemas.openxmlformats.org/drawingml/2006/picture">
             <wp:extent cx="2148840" cy="4654002"/>
-            <wp:docPr id="7" name="Picture 7"/>
+            <wp:docPr id="11" name="Picture 11"/>
             <wp:cNvGraphicFramePr>
               <a:graphicFrameLocks noChangeAspect="1"/>
             </wp:cNvGraphicFramePr>
@@ -2744,7 +3238,7 @@
                     <pic:cNvPicPr/>
                   </pic:nvPicPr>
                   <pic:blipFill>
-                    <a:blip r:embed="rId11"/>
+                    <a:blip r:embed="rId12"/>
                     <a:stretch>
                       <a:fillRect/>
                     </a:stretch>
@@ -2775,6 +3269,204 @@
           <w:sz w:val="18"/>
         </w:rPr>
         <w:t>Staff mobile Shift Roster for Serah. Calendar selects Sunday 4 October 2026. The same client/activities card shows 1:15 AM – 3:18 AM with status ACTIVE, instead of Saturday 3 October 4:15 PM – 5:18 PM Australian time.</w:t>
+      </w:r>
+    </w:p>
+    <w:p>
+      <w:pPr>
+        <w:jc w:val="left"/>
+      </w:pPr>
+      <w:r>
+        <w:rPr>
+          <w:b/>
+          <w:color w:val="030637"/>
+          <w:sz w:val="22"/>
+        </w:rPr>
+        <w:t>Figure 4 — Add a document — file types limited to PDF and Word</w:t>
+      </w:r>
+    </w:p>
+    <w:p>
+      <w:pPr>
+        <w:jc w:val="center"/>
+      </w:pPr>
+      <w:r>
+        <w:drawing>
+          <wp:inline xmlns:a="http://schemas.openxmlformats.org/drawingml/2006/main" xmlns:pic="http://schemas.openxmlformats.org/drawingml/2006/picture">
+            <wp:extent cx="2148840" cy="4654002"/>
+            <wp:docPr id="12" name="Picture 12"/>
+            <wp:cNvGraphicFramePr>
+              <a:graphicFrameLocks noChangeAspect="1"/>
+            </wp:cNvGraphicFramePr>
+            <a:graphic>
+              <a:graphicData uri="http://schemas.openxmlformats.org/drawingml/2006/picture">
+                <pic:pic>
+                  <pic:nvPicPr>
+                    <pic:cNvPr id="0" name="fig-04-add-document-no-images.jpg"/>
+                    <pic:cNvPicPr/>
+                  </pic:nvPicPr>
+                  <pic:blipFill>
+                    <a:blip r:embed="rId13"/>
+                    <a:stretch>
+                      <a:fillRect/>
+                    </a:stretch>
+                  </pic:blipFill>
+                  <pic:spPr>
+                    <a:xfrm>
+                      <a:off x="0" y="0"/>
+                      <a:ext cx="2148840" cy="4654002"/>
+                    </a:xfrm>
+                    <a:prstGeom prst="rect"/>
+                  </pic:spPr>
+                </pic:pic>
+              </a:graphicData>
+            </a:graphic>
+          </wp:inline>
+        </w:drawing>
+      </w:r>
+    </w:p>
+    <w:p>
+      <w:pPr>
+        <w:spacing w:after="240"/>
+        <w:jc w:val="left"/>
+      </w:pPr>
+      <w:r>
+        <w:rPr>
+          <w:i/>
+          <w:color w:val="444444"/>
+          <w:sz w:val="18"/>
+        </w:rPr>
+        <w:t>Staff “Add a document” screen. The Upload File control reads “Tap to select file (.pdf, .doc, .docx)”. Image formats (JPEG, PNG, HEIC) are not listed or offered.</w:t>
+      </w:r>
+    </w:p>
+    <w:p>
+      <w:pPr>
+        <w:jc w:val="left"/>
+      </w:pPr>
+      <w:r>
+        <w:rPr>
+          <w:b/>
+          <w:color w:val="030637"/>
+          <w:sz w:val="22"/>
+        </w:rPr>
+        <w:t>Figure 5 — Edit Shift Report — two clients on one report, no selector</w:t>
+      </w:r>
+    </w:p>
+    <w:p>
+      <w:pPr>
+        <w:jc w:val="center"/>
+      </w:pPr>
+      <w:r>
+        <w:drawing>
+          <wp:inline xmlns:a="http://schemas.openxmlformats.org/drawingml/2006/main" xmlns:pic="http://schemas.openxmlformats.org/drawingml/2006/picture">
+            <wp:extent cx="2148840" cy="4654002"/>
+            <wp:docPr id="13" name="Picture 13"/>
+            <wp:cNvGraphicFramePr>
+              <a:graphicFrameLocks noChangeAspect="1"/>
+            </wp:cNvGraphicFramePr>
+            <a:graphic>
+              <a:graphicData uri="http://schemas.openxmlformats.org/drawingml/2006/picture">
+                <pic:pic>
+                  <pic:nvPicPr>
+                    <pic:cNvPr id="0" name="fig-05-edit-report-two-clients.jpg"/>
+                    <pic:cNvPicPr/>
+                  </pic:nvPicPr>
+                  <pic:blipFill>
+                    <a:blip r:embed="rId14"/>
+                    <a:stretch>
+                      <a:fillRect/>
+                    </a:stretch>
+                  </pic:blipFill>
+                  <pic:spPr>
+                    <a:xfrm>
+                      <a:off x="0" y="0"/>
+                      <a:ext cx="2148840" cy="4654002"/>
+                    </a:xfrm>
+                    <a:prstGeom prst="rect"/>
+                  </pic:spPr>
+                </pic:pic>
+              </a:graphicData>
+            </a:graphic>
+          </wp:inline>
+        </w:drawing>
+      </w:r>
+    </w:p>
+    <w:p>
+      <w:pPr>
+        <w:spacing w:after="240"/>
+        <w:jc w:val="left"/>
+      </w:pPr>
+      <w:r>
+        <w:rPr>
+          <w:i/>
+          <w:color w:val="444444"/>
+          <w:sz w:val="18"/>
+        </w:rPr>
+        <w:t>Edit Shift Report for staff Serah. Client’s Name is shown as a combined string “Ajeh Wumi Tao, Olatunji John”. There is no control to choose which client the report is for. One form (urgent matters, medications, etc.) applies to both clients.</w:t>
+      </w:r>
+    </w:p>
+    <w:p>
+      <w:pPr>
+        <w:jc w:val="left"/>
+      </w:pPr>
+      <w:r>
+        <w:rPr>
+          <w:b/>
+          <w:color w:val="030637"/>
+          <w:sz w:val="22"/>
+        </w:rPr>
+        <w:t>Figure 6 — Completed multi-client shift — trip control still available</w:t>
+      </w:r>
+    </w:p>
+    <w:p>
+      <w:pPr>
+        <w:jc w:val="center"/>
+      </w:pPr>
+      <w:r>
+        <w:drawing>
+          <wp:inline xmlns:a="http://schemas.openxmlformats.org/drawingml/2006/main" xmlns:pic="http://schemas.openxmlformats.org/drawingml/2006/picture">
+            <wp:extent cx="2148840" cy="4654002"/>
+            <wp:docPr id="14" name="Picture 14"/>
+            <wp:cNvGraphicFramePr>
+              <a:graphicFrameLocks noChangeAspect="1"/>
+            </wp:cNvGraphicFramePr>
+            <a:graphic>
+              <a:graphicData uri="http://schemas.openxmlformats.org/drawingml/2006/picture">
+                <pic:pic>
+                  <pic:nvPicPr>
+                    <pic:cNvPr id="0" name="fig-06-completed-shift-multi-client-trip.jpg"/>
+                    <pic:cNvPicPr/>
+                  </pic:nvPicPr>
+                  <pic:blipFill>
+                    <a:blip r:embed="rId10"/>
+                    <a:stretch>
+                      <a:fillRect/>
+                    </a:stretch>
+                  </pic:blipFill>
+                  <pic:spPr>
+                    <a:xfrm>
+                      <a:off x="0" y="0"/>
+                      <a:ext cx="2148840" cy="4654002"/>
+                    </a:xfrm>
+                    <a:prstGeom prst="rect"/>
+                  </pic:spPr>
+                </pic:pic>
+              </a:graphicData>
+            </a:graphic>
+          </wp:inline>
+        </w:drawing>
+      </w:r>
+    </w:p>
+    <w:p>
+      <w:pPr>
+        <w:spacing w:after="240"/>
+        <w:jc w:val="left"/>
+      </w:pPr>
+      <w:r>
+        <w:rPr>
+          <w:i/>
+          <w:color w:val="444444"/>
+          <w:sz w:val="18"/>
+        </w:rPr>
+        <w:t>Shift detail for clients “David David David, Fateru Israel Oluwapelumi” (staff Serah Adeniyi). Status is “Shift Completed” with message “Great job! Your shift has been completed successfully.” Activities include Transport. The steering-wheel trip button remains visible. There is no client selector for which participant a trip would cover.</w:t>
       </w:r>
     </w:p>
     <w:p>
@@ -3028,7 +3720,7 @@
           <w:i/>
           <w:sz w:val="18"/>
         </w:rPr>
-        <w:t>Document format: Microsoft Word (.docx). Embedded files: fig-01-shift-detail-not-started.jpg, fig-02-admin-schedule-board.jpg, fig-03-staff-roster-4-oct.jpg (docs/screenshots/).</w:t>
+        <w:t>Document format: Microsoft Word (.docx). Embedded files: fig-01-shift-detail-not-started.jpg, fig-02-admin-schedule-board.jpg, fig-03-staff-roster-4-oct.jpg, fig-04-add-document-no-images.jpg, fig-05-edit-report-two-clients.jpg, fig-06-completed-shift-multi-client-trip.jpg (docs/screenshots/).</w:t>
       </w:r>
     </w:p>
     <w:sectPr>

</xml_diff>